<commit_message>
Updated study notes and profiles in 7 languages with extensive content and metadata edits
</commit_message>
<xml_diff>
--- a/eng/docx/001.content.docx
+++ b/eng/docx/001.content.docx
@@ -6021,6 +6021,405 @@
         <w:rPr>
           <w:lang w:val="en_US" w:bidi="en_US"/>
         </w:rPr>
+        <w:t>The Amalekites</w:t>
+      </w:r>
+      <w:r>
+        <w:rPr>
+          <w:lang w:val="en_US" w:bidi="en_US"/>
+        </w:rPr>
+      </w:r>
+    </w:p>
+    <w:p>
+      <w:pPr/>
+      <w:r>
+        <w:rPr>
+          <w:lang w:val="en_US" w:bidi="en_US"/>
+        </w:rPr>
+      </w:r>
+      <w:r>
+        <w:rPr>
+          <w:lang w:val="en_US" w:bidi="en_US"/>
+        </w:rPr>
+        <w:t>The Amalekites were the descendants of Amalek, a grandson of Esau (</w:t>
+      </w:r>
+      <w:hyperlink r:id="rId245">
+        <w:r>
+          <w:rPr>
+            <w:lang w:val="en_US" w:bidi="en_US"/>
+          </w:rPr>
+          <w:rPr>
+            <w:color w:val="0000EE"/>
+            <w:u w:val="single"/>
+          </w:rPr>
+          <w:t>Genesis 36:12</w:t>
+        </w:r>
+      </w:hyperlink>
+      <w:r>
+        <w:rPr>
+          <w:lang w:val="en_US" w:bidi="en_US"/>
+        </w:rPr>
+        <w:t xml:space="preserve">; </w:t>
+      </w:r>
+      <w:hyperlink r:id="rId246">
+        <w:r>
+          <w:rPr>
+            <w:lang w:val="en_US" w:bidi="en_US"/>
+          </w:rPr>
+          <w:rPr>
+            <w:color w:val="0000EE"/>
+            <w:u w:val="single"/>
+          </w:rPr>
+          <w:t>1 Chronicles 1:36</w:t>
+        </w:r>
+      </w:hyperlink>
+      <w:r>
+        <w:rPr>
+          <w:lang w:val="en_US" w:bidi="en_US"/>
+        </w:rPr>
+        <w:t>). They were nomadic herdsmen. Their territory in the Negev stretched from south of Beersheba to the southeast, reaching Elath and Ezion-geber. They likely raided west into the coastal plain, east into the Arabah wastelands, and possibly into Arabia.</w:t>
+      </w:r>
+    </w:p>
+    <w:p>
+      <w:pPr/>
+      <w:r>
+        <w:rPr>
+          <w:lang w:val="en_US" w:bidi="en_US"/>
+        </w:rPr>
+      </w:r>
+      <w:r>
+        <w:rPr>
+          <w:lang w:val="en_US" w:bidi="en_US"/>
+        </w:rPr>
+        <w:t>The Amalekites were strong enemies of Israel. Israel first met the Amalekite warriors at Rephidim near Sinai when they attacked Israel (</w:t>
+      </w:r>
+      <w:hyperlink r:id="rId247">
+        <w:r>
+          <w:rPr>
+            <w:lang w:val="en_US" w:bidi="en_US"/>
+          </w:rPr>
+          <w:rPr>
+            <w:color w:val="0000EE"/>
+            <w:u w:val="single"/>
+          </w:rPr>
+          <w:t>Exodus 17:8–16</w:t>
+        </w:r>
+      </w:hyperlink>
+      <w:r>
+        <w:rPr>
+          <w:lang w:val="en_US" w:bidi="en_US"/>
+        </w:rPr>
+        <w:t>). Joshua and the Israelite army defeated the Amalekites in this battle. Later, the Amalekites stopped Israel's disobedient attempt to enter the promised land (</w:t>
+      </w:r>
+      <w:hyperlink r:id="rId248">
+        <w:r>
+          <w:rPr>
+            <w:lang w:val="en_US" w:bidi="en_US"/>
+          </w:rPr>
+          <w:rPr>
+            <w:color w:val="0000EE"/>
+            <w:u w:val="single"/>
+          </w:rPr>
+          <w:t>Numbers 14:39–45</w:t>
+        </w:r>
+      </w:hyperlink>
+      <w:r>
+        <w:rPr>
+          <w:lang w:val="en_US" w:bidi="en_US"/>
+        </w:rPr>
+        <w:t xml:space="preserve">). </w:t>
+      </w:r>
+    </w:p>
+    <w:p>
+      <w:pPr/>
+      <w:r>
+        <w:rPr>
+          <w:lang w:val="en_US" w:bidi="en_US"/>
+        </w:rPr>
+      </w:r>
+      <w:r>
+        <w:rPr>
+          <w:lang w:val="en_US" w:bidi="en_US"/>
+        </w:rPr>
+        <w:t>Because of their hostility, Moses told Israel to destroy them (</w:t>
+      </w:r>
+      <w:hyperlink r:id="rId249">
+        <w:r>
+          <w:rPr>
+            <w:lang w:val="en_US" w:bidi="en_US"/>
+          </w:rPr>
+          <w:rPr>
+            <w:color w:val="0000EE"/>
+            <w:u w:val="single"/>
+          </w:rPr>
+          <w:t>Deuteronomy 25:17–19</w:t>
+        </w:r>
+      </w:hyperlink>
+      <w:r>
+        <w:rPr>
+          <w:lang w:val="en_US" w:bidi="en_US"/>
+        </w:rPr>
+        <w:t xml:space="preserve">). But the Amalekites continued to live in the Negev (see </w:t>
+      </w:r>
+      <w:hyperlink r:id="rId250">
+        <w:r>
+          <w:rPr>
+            <w:lang w:val="en_US" w:bidi="en_US"/>
+          </w:rPr>
+          <w:rPr>
+            <w:color w:val="0000EE"/>
+            <w:u w:val="single"/>
+          </w:rPr>
+          <w:t>Judges 3:12–14</w:t>
+        </w:r>
+      </w:hyperlink>
+      <w:r>
+        <w:rPr>
+          <w:lang w:val="en_US" w:bidi="en_US"/>
+        </w:rPr>
+        <w:t xml:space="preserve">; </w:t>
+      </w:r>
+      <w:hyperlink r:id="rId251">
+        <w:r>
+          <w:rPr>
+            <w:lang w:val="en_US" w:bidi="en_US"/>
+          </w:rPr>
+          <w:rPr>
+            <w:color w:val="0000EE"/>
+            <w:u w:val="single"/>
+          </w:rPr>
+          <w:t>6:33</w:t>
+        </w:r>
+      </w:hyperlink>
+      <w:r>
+        <w:rPr>
+          <w:lang w:val="en_US" w:bidi="en_US"/>
+        </w:rPr>
+        <w:t xml:space="preserve">; </w:t>
+      </w:r>
+      <w:hyperlink r:id="rId252">
+        <w:r>
+          <w:rPr>
+            <w:lang w:val="en_US" w:bidi="en_US"/>
+          </w:rPr>
+          <w:rPr>
+            <w:color w:val="0000EE"/>
+            <w:u w:val="single"/>
+          </w:rPr>
+          <w:t>1 Samuel 14:47–48</w:t>
+        </w:r>
+      </w:hyperlink>
+      <w:r>
+        <w:rPr>
+          <w:lang w:val="en_US" w:bidi="en_US"/>
+        </w:rPr>
+        <w:t xml:space="preserve">; </w:t>
+      </w:r>
+      <w:hyperlink r:id="rId253">
+        <w:r>
+          <w:rPr>
+            <w:lang w:val="en_US" w:bidi="en_US"/>
+          </w:rPr>
+          <w:rPr>
+            <w:color w:val="0000EE"/>
+            <w:u w:val="single"/>
+          </w:rPr>
+          <w:t>15:1–35</w:t>
+        </w:r>
+      </w:hyperlink>
+      <w:r>
+        <w:rPr>
+          <w:lang w:val="en_US" w:bidi="en_US"/>
+        </w:rPr>
+        <w:t>). Those who survived remained enemies of Israel (</w:t>
+      </w:r>
+      <w:hyperlink r:id="rId254">
+        <w:r>
+          <w:rPr>
+            <w:lang w:val="en_US" w:bidi="en_US"/>
+          </w:rPr>
+          <w:rPr>
+            <w:color w:val="0000EE"/>
+            <w:u w:val="single"/>
+          </w:rPr>
+          <w:t>1 Samuel 27:8</w:t>
+        </w:r>
+      </w:hyperlink>
+      <w:r>
+        <w:rPr>
+          <w:lang w:val="en_US" w:bidi="en_US"/>
+        </w:rPr>
+        <w:t xml:space="preserve">; </w:t>
+      </w:r>
+      <w:hyperlink r:id="rId255">
+        <w:r>
+          <w:rPr>
+            <w:lang w:val="en_US" w:bidi="en_US"/>
+          </w:rPr>
+          <w:rPr>
+            <w:color w:val="0000EE"/>
+            <w:u w:val="single"/>
+          </w:rPr>
+          <w:t>30:1–20</w:t>
+        </w:r>
+      </w:hyperlink>
+      <w:r>
+        <w:rPr>
+          <w:lang w:val="en_US" w:bidi="en_US"/>
+        </w:rPr>
+        <w:t xml:space="preserve">; </w:t>
+      </w:r>
+      <w:hyperlink r:id="rId256">
+        <w:r>
+          <w:rPr>
+            <w:lang w:val="en_US" w:bidi="en_US"/>
+          </w:rPr>
+          <w:rPr>
+            <w:color w:val="0000EE"/>
+            <w:u w:val="single"/>
+          </w:rPr>
+          <w:t>2 Samuel 8:11–12</w:t>
+        </w:r>
+      </w:hyperlink>
+      <w:r>
+        <w:rPr>
+          <w:lang w:val="en_US" w:bidi="en_US"/>
+        </w:rPr>
+        <w:t xml:space="preserve">; </w:t>
+      </w:r>
+      <w:hyperlink r:id="rId257">
+        <w:r>
+          <w:rPr>
+            <w:lang w:val="en_US" w:bidi="en_US"/>
+          </w:rPr>
+          <w:rPr>
+            <w:color w:val="0000EE"/>
+            <w:u w:val="single"/>
+          </w:rPr>
+          <w:t>Psalm 83:1–8</w:t>
+        </w:r>
+      </w:hyperlink>
+      <w:r>
+        <w:rPr>
+          <w:lang w:val="en_US" w:bidi="en_US"/>
+        </w:rPr>
+        <w:t>). This remaining group was finally destroyed during King Hezekiah's reign (</w:t>
+      </w:r>
+      <w:hyperlink r:id="rId258">
+        <w:r>
+          <w:rPr>
+            <w:lang w:val="en_US" w:bidi="en_US"/>
+          </w:rPr>
+          <w:rPr>
+            <w:color w:val="0000EE"/>
+            <w:u w:val="single"/>
+          </w:rPr>
+          <w:t>1 Chronicles 4:42–43</w:t>
+        </w:r>
+      </w:hyperlink>
+      <w:r>
+        <w:rPr>
+          <w:lang w:val="en_US" w:bidi="en_US"/>
+        </w:rPr>
+        <w:t>). In the book of Esther, Haman, a descendant of King Agag, showed their hostility to the very end (</w:t>
+      </w:r>
+      <w:hyperlink r:id="rId259">
+        <w:r>
+          <w:rPr>
+            <w:lang w:val="en_US" w:bidi="en_US"/>
+          </w:rPr>
+          <w:rPr>
+            <w:color w:val="0000EE"/>
+            <w:u w:val="single"/>
+          </w:rPr>
+          <w:t>Esther 3</w:t>
+        </w:r>
+      </w:hyperlink>
+      <w:r>
+        <w:rPr>
+          <w:lang w:val="en_US" w:bidi="en_US"/>
+        </w:rPr>
+        <w:t xml:space="preserve">; see </w:t>
+      </w:r>
+      <w:hyperlink r:id="rId253">
+        <w:r>
+          <w:rPr>
+            <w:lang w:val="en_US" w:bidi="en_US"/>
+          </w:rPr>
+          <w:rPr>
+            <w:color w:val="0000EE"/>
+            <w:u w:val="single"/>
+          </w:rPr>
+          <w:t>1 Samuel 15</w:t>
+        </w:r>
+      </w:hyperlink>
+      <w:r>
+        <w:rPr>
+          <w:lang w:val="en_US" w:bidi="en_US"/>
+        </w:rPr>
+        <w:t>).</w:t>
+      </w:r>
+    </w:p>
+    <w:p>
+      <w:pPr/>
+      <w:r>
+        <w:rPr>
+          <w:lang w:val="en_US" w:bidi="en_US"/>
+        </w:rPr>
+      </w:r>
+      <w:r>
+        <w:rPr>
+          <w:u w:val="single"/>
+          <w:lang w:val="en_US" w:bidi="en_US"/>
+        </w:rPr>
+        <w:t>Passages for Further Study</w:t>
+      </w:r>
+    </w:p>
+    <w:p>
+      <w:pPr/>
+      <w:r>
+        <w:rPr>
+          <w:lang w:val="en_US" w:bidi="en_US"/>
+        </w:rPr>
+      </w:r>
+      <w:hyperlink r:id="rId260">
+        <w:r>
+          <w:rPr>
+            <w:lang w:val="en_US" w:bidi="en_US"/>
+          </w:rPr>
+          <w:rPr>
+            <w:color w:val="0000EE"/>
+            <w:u w:val="single"/>
+          </w:rPr>
+          <w:t>1 Samuel 30:1–31</w:t>
+        </w:r>
+      </w:hyperlink>
+      <w:r>
+        <w:rPr>
+          <w:lang w:val="en_US" w:bidi="en_US"/>
+        </w:rPr>
+      </w:r>
+      <w:r>
+        <w:rPr>
+          <w:lang w:val="en_US" w:bidi="en_US"/>
+        </w:rPr>
+      </w:r>
+    </w:p>
+    <w:p>
+      <w:pPr/>
+      <w:r>
+        <w:rPr>
+          <w:lang w:val="en_US" w:bidi="en_US"/>
+        </w:rPr>
+      </w:r>
+    </w:p>
+    <w:p>
+      <w:pPr>
+        <w:pStyle w:val="Heading2"/>
+      </w:pPr>
+      <w:r>
+        <w:rPr>
+          <w:lang w:val="en_US" w:bidi="en_US"/>
+        </w:rPr>
         <w:t>Annas and Caiaphas</w:t>
       </w:r>
       <w:r>
@@ -6056,7 +6455,7 @@
         </w:rPr>
         <w:t>Annas was the Jewish high priest around AD 6 to 15. Even after the Roman procurator of Judea removed him, he remained very powerful and influential in the Jewish high council. People still called him "high priest" fifteen to twenty years later (</w:t>
       </w:r>
-      <w:hyperlink r:id="rId245">
+      <w:hyperlink r:id="rId261">
         <w:r>
           <w:rPr>
             <w:lang w:val="en_US" w:bidi="en_US"/>
@@ -6074,7 +6473,7 @@
         </w:rPr>
         <w:t xml:space="preserve">; </w:t>
       </w:r>
-      <w:hyperlink r:id="rId246">
+      <w:hyperlink r:id="rId262">
         <w:r>
           <w:rPr>
             <w:lang w:val="en_US" w:bidi="en_US"/>
@@ -6092,7 +6491,7 @@
         </w:rPr>
         <w:t>). This might be because Jews believed high priests held their position for life. Five of his sons and his son-in-law, Caiaphas, became high priests after him. According to the Gospel of John, when Jesus was arrested, he was first taken to Annas for questioning before being handed over to Caiaphas for the official trial (</w:t>
       </w:r>
-      <w:hyperlink r:id="rId247">
+      <w:hyperlink r:id="rId263">
         <w:r>
           <w:rPr>
             <w:lang w:val="en_US" w:bidi="en_US"/>
@@ -6124,7 +6523,7 @@
         </w:rPr>
         <w:t>Caiaphas was the Jewish high priest from around AD 18 to 36. He worked closely with his influential father-in-law, Annas. Caiaphas argued in the high council that sacrificing Jesus would be better than risking the nation's destruction (</w:t>
       </w:r>
-      <w:hyperlink r:id="rId248">
+      <w:hyperlink r:id="rId264">
         <w:r>
           <w:rPr>
             <w:lang w:val="en_US" w:bidi="en_US"/>
@@ -6142,7 +6541,7 @@
         </w:rPr>
         <w:t>). God gave him these prophetic words because he was the high priest (</w:t>
       </w:r>
-      <w:hyperlink r:id="rId249">
+      <w:hyperlink r:id="rId265">
         <w:r>
           <w:rPr>
             <w:lang w:val="en_US" w:bidi="en_US"/>
@@ -6160,7 +6559,7 @@
         </w:rPr>
         <w:t>). During Jesus' trial, Caiaphas tore his robes when Jesus claimed to be the Son of God. He urged the high council to condemn Jesus for blasphemy (</w:t>
       </w:r>
-      <w:hyperlink r:id="rId250">
+      <w:hyperlink r:id="rId266">
         <w:r>
           <w:rPr>
             <w:lang w:val="en_US" w:bidi="en_US"/>
@@ -6192,7 +6591,7 @@
         </w:rPr>
         <w:t>Shortly after Jesus's execution, Jewish leaders grew worried about the rising number of Christ's followers. Annas and Caiaphas questioned Peter and John about healing a crippled beggar and preaching about the resurrection of the dead (</w:t>
       </w:r>
-      <w:hyperlink r:id="rId251">
+      <w:hyperlink r:id="rId267">
         <w:r>
           <w:rPr>
             <w:lang w:val="en_US" w:bidi="en_US"/>
@@ -6233,7 +6632,7 @@
           <w:lang w:val="en_US" w:bidi="en_US"/>
         </w:rPr>
       </w:r>
-      <w:hyperlink r:id="rId252">
+      <w:hyperlink r:id="rId268">
         <w:r>
           <w:rPr>
             <w:lang w:val="en_US" w:bidi="en_US"/>
@@ -6251,7 +6650,7 @@
         </w:rPr>
         <w:t xml:space="preserve">, </w:t>
       </w:r>
-      <w:hyperlink r:id="rId253">
+      <w:hyperlink r:id="rId269">
         <w:r>
           <w:rPr>
             <w:lang w:val="en_US" w:bidi="en_US"/>
@@ -6269,7 +6668,7 @@
         </w:rPr>
         <w:t xml:space="preserve">; </w:t>
       </w:r>
-      <w:hyperlink r:id="rId254">
+      <w:hyperlink r:id="rId270">
         <w:r>
           <w:rPr>
             <w:lang w:val="en_US" w:bidi="en_US"/>
@@ -6287,7 +6686,7 @@
         </w:rPr>
         <w:t xml:space="preserve">; </w:t>
       </w:r>
-      <w:hyperlink r:id="rId245">
+      <w:hyperlink r:id="rId261">
         <w:r>
           <w:rPr>
             <w:lang w:val="en_US" w:bidi="en_US"/>
@@ -6305,7 +6704,7 @@
         </w:rPr>
         <w:t xml:space="preserve">; </w:t>
       </w:r>
-      <w:hyperlink r:id="rId255">
+      <w:hyperlink r:id="rId271">
         <w:r>
           <w:rPr>
             <w:lang w:val="en_US" w:bidi="en_US"/>
@@ -6323,7 +6722,7 @@
         </w:rPr>
         <w:t xml:space="preserve">; </w:t>
       </w:r>
-      <w:hyperlink r:id="rId256">
+      <w:hyperlink r:id="rId272">
         <w:r>
           <w:rPr>
             <w:lang w:val="en_US" w:bidi="en_US"/>
@@ -6341,7 +6740,7 @@
         </w:rPr>
         <w:t xml:space="preserve">; </w:t>
       </w:r>
-      <w:hyperlink r:id="rId251">
+      <w:hyperlink r:id="rId267">
         <w:r>
           <w:rPr>
             <w:lang w:val="en_US" w:bidi="en_US"/>
@@ -6508,7 +6907,7 @@
           <w:lang w:val="en_US" w:bidi="en_US"/>
         </w:rPr>
       </w:r>
-      <w:hyperlink r:id="rId257">
+      <w:hyperlink r:id="rId273">
         <w:r>
           <w:rPr>
             <w:lang w:val="en_US" w:bidi="en_US"/>
@@ -6582,7 +6981,7 @@
         </w:rPr>
         <w:t>When Priscilla and Aquila heard Apollos preach in Ephesus, they invited him to their home. They explained the way of Christ to him more fully. The believers in Ephesus encouraged him because they saw that God had gifted him for ministry. Then, Apollos traveled to the city of Corinth in Achaia. There, he greatly helped the believers. He was an effective defender of the good news about Jesus in public debates with the Jews. He boldly showed that Jesus is the Messiah (God's chosen one) as predicted in Scripture (</w:t>
       </w:r>
-      <w:hyperlink r:id="rId258">
+      <w:hyperlink r:id="rId274">
         <w:r>
           <w:rPr>
             <w:lang w:val="en_US" w:bidi="en_US"/>
@@ -6614,7 +7013,7 @@
         </w:rPr>
         <w:t>Apollos was a skilled speaker. He was popular with some Christians in Corinth because of his intellectual style. His strong ministry attracted some people more than Paul's did (</w:t>
       </w:r>
-      <w:hyperlink r:id="rId259">
+      <w:hyperlink r:id="rId275">
         <w:r>
           <w:rPr>
             <w:lang w:val="en_US" w:bidi="en_US"/>
@@ -6646,7 +7045,7 @@
         </w:rPr>
         <w:t xml:space="preserve">Importantly, Paul never criticized Apollos. He called Apollos a fellow servant and appreciated the work Apollos did. Apollos continued the work that Paul had started, and God blessed both their efforts ("I planted the seed and Apollos watered it," </w:t>
       </w:r>
-      <w:hyperlink r:id="rId260">
+      <w:hyperlink r:id="rId276">
         <w:r>
           <w:rPr>
             <w:lang w:val="en_US" w:bidi="en_US"/>
@@ -6664,7 +7063,7 @@
         </w:rPr>
         <w:t xml:space="preserve">; </w:t>
       </w:r>
-      <w:hyperlink r:id="rId261">
+      <w:hyperlink r:id="rId277">
         <w:r>
           <w:rPr>
             <w:lang w:val="en_US" w:bidi="en_US"/>
@@ -6682,7 +7081,7 @@
         </w:rPr>
         <w:t xml:space="preserve">). Instead, Paul criticized the shallow views and divisions among those who followed Apollos for superficial reasons (see </w:t>
       </w:r>
-      <w:hyperlink r:id="rId262">
+      <w:hyperlink r:id="rId278">
         <w:r>
           <w:rPr>
             <w:lang w:val="en_US" w:bidi="en_US"/>
@@ -6700,7 +7099,7 @@
         </w:rPr>
         <w:t xml:space="preserve">; </w:t>
       </w:r>
-      <w:hyperlink r:id="rId263">
+      <w:hyperlink r:id="rId279">
         <w:r>
           <w:rPr>
             <w:lang w:val="en_US" w:bidi="en_US"/>
@@ -6718,7 +7117,7 @@
         </w:rPr>
         <w:t xml:space="preserve">; </w:t>
       </w:r>
-      <w:hyperlink r:id="rId264">
+      <w:hyperlink r:id="rId280">
         <w:r>
           <w:rPr>
             <w:lang w:val="en_US" w:bidi="en_US"/>
@@ -6750,7 +7149,7 @@
         </w:rPr>
         <w:t>Apollos may have hesitated to return to Corinth from Ephesus because of the divisions his ministry caused (</w:t>
       </w:r>
-      <w:hyperlink r:id="rId265">
+      <w:hyperlink r:id="rId281">
         <w:r>
           <w:rPr>
             <w:lang w:val="en_US" w:bidi="en_US"/>
@@ -6768,7 +7167,7 @@
         </w:rPr>
         <w:t>). However, Paul encouraged him to go back eventually. Several years later, while Apollos was working on the island of Crete, Paul urged Titus to ensure Apollos's needs were met as he departed for an unknown destination for more missionary work (</w:t>
       </w:r>
-      <w:hyperlink r:id="rId266">
+      <w:hyperlink r:id="rId282">
         <w:r>
           <w:rPr>
             <w:lang w:val="en_US" w:bidi="en_US"/>
@@ -6809,7 +7208,7 @@
           <w:lang w:val="en_US" w:bidi="en_US"/>
         </w:rPr>
       </w:r>
-      <w:hyperlink r:id="rId267">
+      <w:hyperlink r:id="rId283">
         <w:r>
           <w:rPr>
             <w:lang w:val="en_US" w:bidi="en_US"/>
@@ -6827,7 +7226,7 @@
         </w:rPr>
         <w:t xml:space="preserve">; </w:t>
       </w:r>
-      <w:hyperlink r:id="rId262">
+      <w:hyperlink r:id="rId278">
         <w:r>
           <w:rPr>
             <w:lang w:val="en_US" w:bidi="en_US"/>
@@ -6845,7 +7244,7 @@
         </w:rPr>
         <w:t xml:space="preserve">; </w:t>
       </w:r>
-      <w:hyperlink r:id="rId268">
+      <w:hyperlink r:id="rId284">
         <w:r>
           <w:rPr>
             <w:lang w:val="en_US" w:bidi="en_US"/>
@@ -6863,7 +7262,7 @@
         </w:rPr>
         <w:t xml:space="preserve">; </w:t>
       </w:r>
-      <w:hyperlink r:id="rId261">
+      <w:hyperlink r:id="rId277">
         <w:r>
           <w:rPr>
             <w:lang w:val="en_US" w:bidi="en_US"/>
@@ -6881,7 +7280,7 @@
         </w:rPr>
         <w:t xml:space="preserve">, </w:t>
       </w:r>
-      <w:hyperlink r:id="rId264">
+      <w:hyperlink r:id="rId280">
         <w:r>
           <w:rPr>
             <w:lang w:val="en_US" w:bidi="en_US"/>
@@ -6899,7 +7298,7 @@
         </w:rPr>
         <w:t xml:space="preserve">; </w:t>
       </w:r>
-      <w:hyperlink r:id="rId265">
+      <w:hyperlink r:id="rId281">
         <w:r>
           <w:rPr>
             <w:lang w:val="en_US" w:bidi="en_US"/>
@@ -6917,7 +7316,7 @@
         </w:rPr>
         <w:t xml:space="preserve">; </w:t>
       </w:r>
-      <w:hyperlink r:id="rId269">
+      <w:hyperlink r:id="rId285">
         <w:r>
           <w:rPr>
             <w:lang w:val="en_US" w:bidi="en_US"/>
@@ -6935,7 +7334,7 @@
         </w:rPr>
         <w:t xml:space="preserve">; </w:t>
       </w:r>
-      <w:hyperlink r:id="rId266">
+      <w:hyperlink r:id="rId282">
         <w:r>
           <w:rPr>
             <w:lang w:val="en_US" w:bidi="en_US"/>
@@ -6995,7 +7394,7 @@
         </w:rPr>
         <w:t>The Arameans belonged to a family of peoples who descended from Noah's son Shem (</w:t>
       </w:r>
-      <w:hyperlink r:id="rId270">
+      <w:hyperlink r:id="rId286">
         <w:r>
           <w:rPr>
             <w:lang w:val="en_US" w:bidi="en_US"/>
@@ -7013,7 +7412,7 @@
         </w:rPr>
         <w:t xml:space="preserve">; compare </w:t>
       </w:r>
-      <w:hyperlink r:id="rId271">
+      <w:hyperlink r:id="rId287">
         <w:r>
           <w:rPr>
             <w:lang w:val="en_US" w:bidi="en_US"/>
@@ -7031,7 +7430,7 @@
         </w:rPr>
         <w:t>). Bethuel and Laban were known as Arameans (</w:t>
       </w:r>
-      <w:hyperlink r:id="rId272">
+      <w:hyperlink r:id="rId288">
         <w:r>
           <w:rPr>
             <w:lang w:val="en_US" w:bidi="en_US"/>
@@ -7049,7 +7448,7 @@
         </w:rPr>
         <w:t xml:space="preserve">; </w:t>
       </w:r>
-      <w:hyperlink r:id="rId273">
+      <w:hyperlink r:id="rId289">
         <w:r>
           <w:rPr>
             <w:lang w:val="en_US" w:bidi="en_US"/>
@@ -7067,7 +7466,7 @@
         </w:rPr>
         <w:t>). Jacob lived with them in Aramean territory for about twenty years (</w:t>
       </w:r>
-      <w:hyperlink r:id="rId274">
+      <w:hyperlink r:id="rId290">
         <w:r>
           <w:rPr>
             <w:lang w:val="en_US" w:bidi="en_US"/>
@@ -7085,7 +7484,7 @@
         </w:rPr>
         <w:t xml:space="preserve">; </w:t>
       </w:r>
-      <w:hyperlink r:id="rId275">
+      <w:hyperlink r:id="rId291">
         <w:r>
           <w:rPr>
             <w:lang w:val="en_US" w:bidi="en_US"/>
@@ -7103,7 +7502,7 @@
         </w:rPr>
         <w:t>), and the people of Israel remembered that their ancestors were culturally Arameans (</w:t>
       </w:r>
-      <w:hyperlink r:id="rId276">
+      <w:hyperlink r:id="rId292">
         <w:r>
           <w:rPr>
             <w:lang w:val="en_US" w:bidi="en_US"/>
@@ -7135,7 +7534,7 @@
         </w:rPr>
         <w:t xml:space="preserve">The Arameans appeared in history around Abraham's time. They lived near the central Euphrates and spread east, west, and north. By about 1100 BC, Aramean tribes were throughout Syria and northern Transjordan (the land east of the Jordan River). They established strong city-states like Zobah and Damascus, which conflicted with the Israelites starting with David's time (see </w:t>
       </w:r>
-      <w:hyperlink r:id="rId277">
+      <w:hyperlink r:id="rId293">
         <w:r>
           <w:rPr>
             <w:lang w:val="en_US" w:bidi="en_US"/>
@@ -7153,7 +7552,7 @@
         </w:rPr>
         <w:t xml:space="preserve">; </w:t>
       </w:r>
-      <w:hyperlink r:id="rId278">
+      <w:hyperlink r:id="rId294">
         <w:r>
           <w:rPr>
             <w:lang w:val="en_US" w:bidi="en_US"/>
@@ -7185,7 +7584,7 @@
         </w:rPr>
         <w:t>After Solomon died, Israel split into northern and southern kingdoms. During this time, the Aramean city of Damascus became very powerful. The rulers of Damascus often took advantage of the fighting between the two kingdoms of Israel. During the war between Israel and Judah from 890 to 880 BC, King Asa of Israel asked Ben-hadad I of Damascus for help (</w:t>
       </w:r>
-      <w:hyperlink r:id="rId279">
+      <w:hyperlink r:id="rId295">
         <w:r>
           <w:rPr>
             <w:lang w:val="en_US" w:bidi="en_US"/>
@@ -7217,7 +7616,7 @@
         </w:rPr>
         <w:t>About thirty years later, in the early 850s BC, Ben-hadad invaded Israel, but Ahab defeated him at Samaria (</w:t>
       </w:r>
-      <w:hyperlink r:id="rId280">
+      <w:hyperlink r:id="rId296">
         <w:r>
           <w:rPr>
             <w:lang w:val="en_US" w:bidi="en_US"/>
@@ -7235,7 +7634,7 @@
         </w:rPr>
         <w:t>) and again at Aphek the next year (</w:t>
       </w:r>
-      <w:hyperlink r:id="rId281">
+      <w:hyperlink r:id="rId297">
         <w:r>
           <w:rPr>
             <w:lang w:val="en_US" w:bidi="en_US"/>
@@ -7253,7 +7652,7 @@
         </w:rPr>
         <w:t>). After three years of peace, Israel and Damascus fought again in 853 BC, and Ahab was killed in battle (</w:t>
       </w:r>
-      <w:hyperlink r:id="rId282">
+      <w:hyperlink r:id="rId298">
         <w:r>
           <w:rPr>
             <w:lang w:val="en_US" w:bidi="en_US"/>
@@ -7271,7 +7670,7 @@
         </w:rPr>
         <w:t xml:space="preserve">). Aramean Damascus continued to cause losses for Israel over the next several decades (see </w:t>
       </w:r>
-      <w:hyperlink r:id="rId283">
+      <w:hyperlink r:id="rId299">
         <w:r>
           <w:rPr>
             <w:lang w:val="en_US" w:bidi="en_US"/>
@@ -7289,7 +7688,7 @@
         </w:rPr>
         <w:t xml:space="preserve">; </w:t>
       </w:r>
-      <w:hyperlink r:id="rId284">
+      <w:hyperlink r:id="rId300">
         <w:r>
           <w:rPr>
             <w:lang w:val="en_US" w:bidi="en_US"/>
@@ -7307,7 +7706,7 @@
         </w:rPr>
         <w:t xml:space="preserve">; </w:t>
       </w:r>
-      <w:hyperlink r:id="rId285">
+      <w:hyperlink r:id="rId301">
         <w:r>
           <w:rPr>
             <w:lang w:val="en_US" w:bidi="en_US"/>
@@ -7339,6 +7738,255 @@
         </w:rPr>
         <w:t>During this time, the Aramean city-states began to feel pressure from Assyria. Assyria first defeated Damascus around 838 BC and forced it to pay tribute in 803 BC. This weakened Damascus, allowing Jehoash, the king of Israel from 798 to 782 BC, to defeat the Arameans and drive them out of Israel's territory around 795 BC (</w:t>
       </w:r>
+      <w:hyperlink r:id="rId302">
+        <w:r>
+          <w:rPr>
+            <w:lang w:val="en_US" w:bidi="en_US"/>
+          </w:rPr>
+          <w:rPr>
+            <w:color w:val="0000EE"/>
+            <w:u w:val="single"/>
+          </w:rPr>
+          <w:t>2 Kings 13:14–25</w:t>
+        </w:r>
+      </w:hyperlink>
+      <w:r>
+        <w:rPr>
+          <w:lang w:val="en_US" w:bidi="en_US"/>
+        </w:rPr>
+        <w:t xml:space="preserve">). Later, Jeroboam II, who ruled from 793 to 753 BC, made Damascus pay tribute to him (see </w:t>
+      </w:r>
+      <w:hyperlink r:id="rId303">
+        <w:r>
+          <w:rPr>
+            <w:lang w:val="en_US" w:bidi="en_US"/>
+          </w:rPr>
+          <w:rPr>
+            <w:color w:val="0000EE"/>
+            <w:u w:val="single"/>
+          </w:rPr>
+          <w:t>2 Kings 14:28</w:t>
+        </w:r>
+      </w:hyperlink>
+      <w:r>
+        <w:rPr>
+          <w:lang w:val="en_US" w:bidi="en_US"/>
+        </w:rPr>
+        <w:t>).</w:t>
+      </w:r>
+    </w:p>
+    <w:p>
+      <w:pPr/>
+      <w:r>
+        <w:rPr>
+          <w:lang w:val="en_US" w:bidi="en_US"/>
+        </w:rPr>
+      </w:r>
+      <w:r>
+        <w:rPr>
+          <w:lang w:val="en_US" w:bidi="en_US"/>
+        </w:rPr>
+        <w:t>Around 738 BC, the Arameans of Damascus allied with Israel to conquer Judah. They captured much land, but their siege of Jerusalem failed (</w:t>
+      </w:r>
+      <w:hyperlink r:id="rId304">
+        <w:r>
+          <w:rPr>
+            <w:lang w:val="en_US" w:bidi="en_US"/>
+          </w:rPr>
+          <w:rPr>
+            <w:color w:val="0000EE"/>
+            <w:u w:val="single"/>
+          </w:rPr>
+          <w:t>2 Kings 16:5</w:t>
+        </w:r>
+      </w:hyperlink>
+      <w:r>
+        <w:rPr>
+          <w:lang w:val="en_US" w:bidi="en_US"/>
+        </w:rPr>
+        <w:t xml:space="preserve">; see also </w:t>
+      </w:r>
+      <w:hyperlink r:id="rId305">
+        <w:r>
+          <w:rPr>
+            <w:lang w:val="en_US" w:bidi="en_US"/>
+          </w:rPr>
+          <w:rPr>
+            <w:color w:val="0000EE"/>
+            <w:u w:val="single"/>
+          </w:rPr>
+          <w:t>2 Chronicles 28:5</w:t>
+        </w:r>
+      </w:hyperlink>
+      <w:r>
+        <w:rPr>
+          <w:lang w:val="en_US" w:bidi="en_US"/>
+        </w:rPr>
+        <w:t>). During this apparent success for Damascus, the prophets Isaiah and Amos predicted the city's destruction (</w:t>
+      </w:r>
+      <w:hyperlink r:id="rId306">
+        <w:r>
+          <w:rPr>
+            <w:lang w:val="en_US" w:bidi="en_US"/>
+          </w:rPr>
+          <w:rPr>
+            <w:color w:val="0000EE"/>
+            <w:u w:val="single"/>
+          </w:rPr>
+          <w:t>Isaiah 8:4</w:t>
+        </w:r>
+      </w:hyperlink>
+      <w:r>
+        <w:rPr>
+          <w:lang w:val="en_US" w:bidi="en_US"/>
+        </w:rPr>
+        <w:t xml:space="preserve">; </w:t>
+      </w:r>
+      <w:hyperlink r:id="rId307">
+        <w:r>
+          <w:rPr>
+            <w:lang w:val="en_US" w:bidi="en_US"/>
+          </w:rPr>
+          <w:rPr>
+            <w:color w:val="0000EE"/>
+            <w:u w:val="single"/>
+          </w:rPr>
+          <w:t>17:1</w:t>
+        </w:r>
+      </w:hyperlink>
+      <w:r>
+        <w:rPr>
+          <w:lang w:val="en_US" w:bidi="en_US"/>
+        </w:rPr>
+        <w:t xml:space="preserve">; </w:t>
+      </w:r>
+      <w:hyperlink r:id="rId308">
+        <w:r>
+          <w:rPr>
+            <w:lang w:val="en_US" w:bidi="en_US"/>
+          </w:rPr>
+          <w:rPr>
+            <w:color w:val="0000EE"/>
+            <w:u w:val="single"/>
+          </w:rPr>
+          <w:t>Amos 1:3–5</w:t>
+        </w:r>
+      </w:hyperlink>
+      <w:r>
+        <w:rPr>
+          <w:lang w:val="en_US" w:bidi="en_US"/>
+        </w:rPr>
+        <w:t>). Instead of trusting God, King Ahaz of Judah sought protection from the Assyrians. The Assyrians responded to his gifts by attacking Damascus and exiling its people in 733 and 732 BC (</w:t>
+      </w:r>
+      <w:hyperlink r:id="rId309">
+        <w:r>
+          <w:rPr>
+            <w:lang w:val="en_US" w:bidi="en_US"/>
+          </w:rPr>
+          <w:rPr>
+            <w:color w:val="0000EE"/>
+            <w:u w:val="single"/>
+          </w:rPr>
+          <w:t>2 Kings 16:7–11</w:t>
+        </w:r>
+      </w:hyperlink>
+      <w:r>
+        <w:rPr>
+          <w:lang w:val="en_US" w:bidi="en_US"/>
+        </w:rPr>
+        <w:t>). Damascus ceased to be an independent city-state.</w:t>
+      </w:r>
+    </w:p>
+    <w:p>
+      <w:pPr/>
+      <w:r>
+        <w:rPr>
+          <w:lang w:val="en_US" w:bidi="en_US"/>
+        </w:rPr>
+      </w:r>
+      <w:r>
+        <w:rPr>
+          <w:lang w:val="en_US" w:bidi="en_US"/>
+        </w:rPr>
+        <w:t xml:space="preserve">The Arameans' language, Aramaic, became the main language for diplomacy and administration across the Near East (see, for example, </w:t>
+      </w:r>
+      <w:hyperlink r:id="rId310">
+        <w:r>
+          <w:rPr>
+            <w:lang w:val="en_US" w:bidi="en_US"/>
+          </w:rPr>
+          <w:rPr>
+            <w:color w:val="0000EE"/>
+            <w:u w:val="single"/>
+          </w:rPr>
+          <w:t>2 Kings 18:26</w:t>
+        </w:r>
+      </w:hyperlink>
+      <w:r>
+        <w:rPr>
+          <w:lang w:val="en_US" w:bidi="en_US"/>
+        </w:rPr>
+        <w:t xml:space="preserve">). During the exile in Babylon, the Jews started using Aramaic; parts of Ezra and Daniel are in Aramaic. Aramaic was the common language from Egypt to India during the Persian period and was widely spoken in Palestine during Jesus' time (see </w:t>
+      </w:r>
+      <w:hyperlink r:id="rId311">
+        <w:r>
+          <w:rPr>
+            <w:lang w:val="en_US" w:bidi="en_US"/>
+          </w:rPr>
+          <w:rPr>
+            <w:color w:val="0000EE"/>
+            <w:u w:val="single"/>
+          </w:rPr>
+          <w:t>Mark 5:41</w:t>
+        </w:r>
+      </w:hyperlink>
+      <w:r>
+        <w:rPr>
+          <w:lang w:val="en_US" w:bidi="en_US"/>
+        </w:rPr>
+        <w:t xml:space="preserve">; </w:t>
+      </w:r>
+      <w:hyperlink r:id="rId312">
+        <w:r>
+          <w:rPr>
+            <w:lang w:val="en_US" w:bidi="en_US"/>
+          </w:rPr>
+          <w:rPr>
+            <w:color w:val="0000EE"/>
+            <w:u w:val="single"/>
+          </w:rPr>
+          <w:t>1 Corinthians 16:22</w:t>
+        </w:r>
+      </w:hyperlink>
+      <w:r>
+        <w:rPr>
+          <w:lang w:val="en_US" w:bidi="en_US"/>
+        </w:rPr>
+        <w:t>).</w:t>
+      </w:r>
+    </w:p>
+    <w:p>
+      <w:pPr/>
+      <w:r>
+        <w:rPr>
+          <w:lang w:val="en_US" w:bidi="en_US"/>
+        </w:rPr>
+      </w:r>
+      <w:r>
+        <w:rPr>
+          <w:u w:val="single"/>
+          <w:lang w:val="en_US" w:bidi="en_US"/>
+        </w:rPr>
+        <w:t>Passages for Further Study</w:t>
+      </w:r>
+    </w:p>
+    <w:p>
+      <w:pPr/>
+      <w:r>
+        <w:rPr>
+          <w:lang w:val="en_US" w:bidi="en_US"/>
+        </w:rPr>
+      </w:r>
       <w:hyperlink r:id="rId286">
         <w:r>
           <w:rPr>
@@ -7348,14 +7996,14 @@
             <w:color w:val="0000EE"/>
             <w:u w:val="single"/>
           </w:rPr>
-          <w:t>2 Kings 13:14–25</w:t>
-        </w:r>
-      </w:hyperlink>
-      <w:r>
-        <w:rPr>
-          <w:lang w:val="en_US" w:bidi="en_US"/>
-        </w:rPr>
-        <w:t xml:space="preserve">). Later, Jeroboam II, who ruled from 793 to 753 BC, made Damascus pay tribute to him (see </w:t>
+          <w:t>Genesis 10:22–23</w:t>
+        </w:r>
+      </w:hyperlink>
+      <w:r>
+        <w:rPr>
+          <w:lang w:val="en_US" w:bidi="en_US"/>
+        </w:rPr>
+        <w:t xml:space="preserve">; </w:t>
       </w:r>
       <w:hyperlink r:id="rId287">
         <w:r>
@@ -7366,7 +8014,333 @@
             <w:color w:val="0000EE"/>
             <w:u w:val="single"/>
           </w:rPr>
-          <w:t>2 Kings 14:28</w:t>
+          <w:t>22:20–21</w:t>
+        </w:r>
+      </w:hyperlink>
+      <w:r>
+        <w:rPr>
+          <w:lang w:val="en_US" w:bidi="en_US"/>
+        </w:rPr>
+        <w:t xml:space="preserve">; </w:t>
+      </w:r>
+      <w:hyperlink r:id="rId288">
+        <w:r>
+          <w:rPr>
+            <w:lang w:val="en_US" w:bidi="en_US"/>
+          </w:rPr>
+          <w:rPr>
+            <w:color w:val="0000EE"/>
+            <w:u w:val="single"/>
+          </w:rPr>
+          <w:t>25:20</w:t>
+        </w:r>
+      </w:hyperlink>
+      <w:r>
+        <w:rPr>
+          <w:lang w:val="en_US" w:bidi="en_US"/>
+        </w:rPr>
+        <w:t xml:space="preserve">; </w:t>
+      </w:r>
+      <w:hyperlink r:id="rId289">
+        <w:r>
+          <w:rPr>
+            <w:lang w:val="en_US" w:bidi="en_US"/>
+          </w:rPr>
+          <w:rPr>
+            <w:color w:val="0000EE"/>
+            <w:u w:val="single"/>
+          </w:rPr>
+          <w:t>28:1–7</w:t>
+        </w:r>
+      </w:hyperlink>
+      <w:r>
+        <w:rPr>
+          <w:lang w:val="en_US" w:bidi="en_US"/>
+        </w:rPr>
+        <w:t xml:space="preserve">; </w:t>
+      </w:r>
+      <w:hyperlink r:id="rId292">
+        <w:r>
+          <w:rPr>
+            <w:lang w:val="en_US" w:bidi="en_US"/>
+          </w:rPr>
+          <w:rPr>
+            <w:color w:val="0000EE"/>
+            <w:u w:val="single"/>
+          </w:rPr>
+          <w:t>Deuteronomy 26:5</w:t>
+        </w:r>
+      </w:hyperlink>
+      <w:r>
+        <w:rPr>
+          <w:lang w:val="en_US" w:bidi="en_US"/>
+        </w:rPr>
+        <w:t xml:space="preserve">; </w:t>
+      </w:r>
+      <w:hyperlink r:id="rId313">
+        <w:r>
+          <w:rPr>
+            <w:lang w:val="en_US" w:bidi="en_US"/>
+          </w:rPr>
+          <w:rPr>
+            <w:color w:val="0000EE"/>
+            <w:u w:val="single"/>
+          </w:rPr>
+          <w:t>2 Samuel 8:3–4</w:t>
+        </w:r>
+      </w:hyperlink>
+      <w:r>
+        <w:rPr>
+          <w:lang w:val="en_US" w:bidi="en_US"/>
+        </w:rPr>
+        <w:t xml:space="preserve">; </w:t>
+      </w:r>
+      <w:hyperlink r:id="rId314">
+        <w:r>
+          <w:rPr>
+            <w:lang w:val="en_US" w:bidi="en_US"/>
+          </w:rPr>
+          <w:rPr>
+            <w:color w:val="0000EE"/>
+            <w:u w:val="single"/>
+          </w:rPr>
+          <w:t>10:17–19</w:t>
+        </w:r>
+      </w:hyperlink>
+      <w:r>
+        <w:rPr>
+          <w:lang w:val="en_US" w:bidi="en_US"/>
+        </w:rPr>
+        <w:t xml:space="preserve">; </w:t>
+      </w:r>
+      <w:hyperlink r:id="rId315">
+        <w:r>
+          <w:rPr>
+            <w:lang w:val="en_US" w:bidi="en_US"/>
+          </w:rPr>
+          <w:rPr>
+            <w:color w:val="0000EE"/>
+            <w:u w:val="single"/>
+          </w:rPr>
+          <w:t>1 Kings 15:18</w:t>
+        </w:r>
+      </w:hyperlink>
+      <w:r>
+        <w:rPr>
+          <w:lang w:val="en_US" w:bidi="en_US"/>
+        </w:rPr>
+        <w:t xml:space="preserve">; </w:t>
+      </w:r>
+      <w:hyperlink r:id="rId222">
+        <w:r>
+          <w:rPr>
+            <w:lang w:val="en_US" w:bidi="en_US"/>
+          </w:rPr>
+          <w:rPr>
+            <w:color w:val="0000EE"/>
+            <w:u w:val="single"/>
+          </w:rPr>
+          <w:t>1 Kings 20:1–34</w:t>
+        </w:r>
+      </w:hyperlink>
+      <w:r>
+        <w:rPr>
+          <w:lang w:val="en_US" w:bidi="en_US"/>
+        </w:rPr>
+        <w:t xml:space="preserve">; </w:t>
+      </w:r>
+      <w:hyperlink r:id="rId298">
+        <w:r>
+          <w:rPr>
+            <w:lang w:val="en_US" w:bidi="en_US"/>
+          </w:rPr>
+          <w:rPr>
+            <w:color w:val="0000EE"/>
+            <w:u w:val="single"/>
+          </w:rPr>
+          <w:t>22:29–37</w:t>
+        </w:r>
+      </w:hyperlink>
+      <w:r>
+        <w:rPr>
+          <w:lang w:val="en_US" w:bidi="en_US"/>
+        </w:rPr>
+        <w:t xml:space="preserve">; </w:t>
+      </w:r>
+      <w:hyperlink r:id="rId316">
+        <w:r>
+          <w:rPr>
+            <w:lang w:val="en_US" w:bidi="en_US"/>
+          </w:rPr>
+          <w:rPr>
+            <w:color w:val="0000EE"/>
+            <w:u w:val="single"/>
+          </w:rPr>
+          <w:t>2 Kings 13:25</w:t>
+        </w:r>
+      </w:hyperlink>
+      <w:r>
+        <w:rPr>
+          <w:lang w:val="en_US" w:bidi="en_US"/>
+        </w:rPr>
+        <w:t xml:space="preserve">; </w:t>
+      </w:r>
+      <w:hyperlink r:id="rId317">
+        <w:r>
+          <w:rPr>
+            <w:lang w:val="en_US" w:bidi="en_US"/>
+          </w:rPr>
+          <w:rPr>
+            <w:color w:val="0000EE"/>
+            <w:u w:val="single"/>
+          </w:rPr>
+          <w:t>16:9–13</w:t>
+        </w:r>
+      </w:hyperlink>
+      <w:r>
+        <w:rPr>
+          <w:lang w:val="en_US" w:bidi="en_US"/>
+        </w:rPr>
+        <w:t xml:space="preserve">; </w:t>
+      </w:r>
+      <w:hyperlink r:id="rId318">
+        <w:r>
+          <w:rPr>
+            <w:lang w:val="en_US" w:bidi="en_US"/>
+          </w:rPr>
+          <w:rPr>
+            <w:color w:val="0000EE"/>
+            <w:u w:val="single"/>
+          </w:rPr>
+          <w:t>17:24–34</w:t>
+        </w:r>
+      </w:hyperlink>
+      <w:r>
+        <w:rPr>
+          <w:lang w:val="en_US" w:bidi="en_US"/>
+        </w:rPr>
+        <w:t xml:space="preserve">; </w:t>
+      </w:r>
+      <w:hyperlink r:id="rId291">
+        <w:r>
+          <w:rPr>
+            <w:lang w:val="en_US" w:bidi="en_US"/>
+          </w:rPr>
+          <w:rPr>
+            <w:color w:val="0000EE"/>
+            <w:u w:val="single"/>
+          </w:rPr>
+          <w:t>Hosea 12:12</w:t>
+        </w:r>
+      </w:hyperlink>
+      <w:r>
+        <w:rPr>
+          <w:lang w:val="en_US" w:bidi="en_US"/>
+        </w:rPr>
+        <w:t xml:space="preserve">; </w:t>
+      </w:r>
+      <w:hyperlink r:id="rId319">
+        <w:r>
+          <w:rPr>
+            <w:lang w:val="en_US" w:bidi="en_US"/>
+          </w:rPr>
+          <w:rPr>
+            <w:color w:val="0000EE"/>
+            <w:u w:val="single"/>
+          </w:rPr>
+          <w:t>Amos 1:5</w:t>
+        </w:r>
+      </w:hyperlink>
+      <w:r>
+        <w:rPr>
+          <w:lang w:val="en_US" w:bidi="en_US"/>
+        </w:rPr>
+      </w:r>
+      <w:r>
+        <w:rPr>
+          <w:lang w:val="en_US" w:bidi="en_US"/>
+        </w:rPr>
+      </w:r>
+    </w:p>
+    <w:p>
+      <w:pPr/>
+      <w:r>
+        <w:rPr>
+          <w:lang w:val="en_US" w:bidi="en_US"/>
+        </w:rPr>
+      </w:r>
+    </w:p>
+    <w:p>
+      <w:pPr>
+        <w:pStyle w:val="Heading2"/>
+      </w:pPr>
+      <w:r>
+        <w:rPr>
+          <w:lang w:val="en_US" w:bidi="en_US"/>
+        </w:rPr>
+        <w:t>Asa</w:t>
+      </w:r>
+      <w:r>
+        <w:rPr>
+          <w:lang w:val="en_US" w:bidi="en_US"/>
+        </w:rPr>
+      </w:r>
+    </w:p>
+    <w:p>
+      <w:pPr/>
+      <w:r>
+        <w:rPr>
+          <w:lang w:val="en_US" w:bidi="en_US"/>
+        </w:rPr>
+      </w:r>
+      <w:r>
+        <w:rPr>
+          <w:lang w:val="en_US" w:bidi="en_US"/>
+        </w:rPr>
+        <w:t>Asa became the third king of Judah after Solomon's empire split into separate kingdoms. Asa became king after his father, Abijah, who ruled briefly from 913 to 910 BC. Asa reigned for 41 years, from 910 to 869 BC.</w:t>
+      </w:r>
+    </w:p>
+    <w:p>
+      <w:pPr/>
+      <w:r>
+        <w:rPr>
+          <w:lang w:val="en_US" w:bidi="en_US"/>
+        </w:rPr>
+      </w:r>
+      <w:r>
+        <w:rPr>
+          <w:lang w:val="en_US" w:bidi="en_US"/>
+        </w:rPr>
+        <w:t>At the start of his reign, Asa was a good king. He opposed the worship of false gods, destroyed the Asherah pole his grandmother Maacah had set up, and removed her political influence (</w:t>
+      </w:r>
+      <w:hyperlink r:id="rId320">
+        <w:r>
+          <w:rPr>
+            <w:lang w:val="en_US" w:bidi="en_US"/>
+          </w:rPr>
+          <w:rPr>
+            <w:color w:val="0000EE"/>
+            <w:u w:val="single"/>
+          </w:rPr>
+          <w:t>1 Kings 15:13</w:t>
+        </w:r>
+      </w:hyperlink>
+      <w:r>
+        <w:rPr>
+          <w:lang w:val="en_US" w:bidi="en_US"/>
+        </w:rPr>
+        <w:t xml:space="preserve">; </w:t>
+      </w:r>
+      <w:hyperlink r:id="rId321">
+        <w:r>
+          <w:rPr>
+            <w:lang w:val="en_US" w:bidi="en_US"/>
+          </w:rPr>
+          <w:rPr>
+            <w:color w:val="0000EE"/>
+            <w:u w:val="single"/>
+          </w:rPr>
+          <w:t>2 Chronicles 15:16</w:t>
         </w:r>
       </w:hyperlink>
       <w:r>
@@ -7387,176 +8361,36 @@
         <w:rPr>
           <w:lang w:val="en_US" w:bidi="en_US"/>
         </w:rPr>
-        <w:t>Around 738 BC, the Arameans of Damascus allied with Israel to conquer Judah. They captured much land, but their siege of Jerusalem failed (</w:t>
-      </w:r>
-      <w:hyperlink r:id="rId288">
-        <w:r>
-          <w:rPr>
-            <w:lang w:val="en_US" w:bidi="en_US"/>
-          </w:rPr>
-          <w:rPr>
-            <w:color w:val="0000EE"/>
-            <w:u w:val="single"/>
-          </w:rPr>
-          <w:t>2 Kings 16:5</w:t>
-        </w:r>
-      </w:hyperlink>
-      <w:r>
-        <w:rPr>
-          <w:lang w:val="en_US" w:bidi="en_US"/>
-        </w:rPr>
-        <w:t xml:space="preserve">; see also </w:t>
-      </w:r>
-      <w:hyperlink r:id="rId289">
-        <w:r>
-          <w:rPr>
-            <w:lang w:val="en_US" w:bidi="en_US"/>
-          </w:rPr>
-          <w:rPr>
-            <w:color w:val="0000EE"/>
-            <w:u w:val="single"/>
-          </w:rPr>
-          <w:t>2 Chronicles 28:5</w:t>
-        </w:r>
-      </w:hyperlink>
-      <w:r>
-        <w:rPr>
-          <w:lang w:val="en_US" w:bidi="en_US"/>
-        </w:rPr>
-        <w:t>). During this apparent success for Damascus, the prophets Isaiah and Amos predicted the city's destruction (</w:t>
-      </w:r>
-      <w:hyperlink r:id="rId290">
-        <w:r>
-          <w:rPr>
-            <w:lang w:val="en_US" w:bidi="en_US"/>
-          </w:rPr>
-          <w:rPr>
-            <w:color w:val="0000EE"/>
-            <w:u w:val="single"/>
-          </w:rPr>
-          <w:t>Isaiah 8:4</w:t>
-        </w:r>
-      </w:hyperlink>
-      <w:r>
-        <w:rPr>
-          <w:lang w:val="en_US" w:bidi="en_US"/>
-        </w:rPr>
-        <w:t xml:space="preserve">; </w:t>
-      </w:r>
-      <w:hyperlink r:id="rId291">
-        <w:r>
-          <w:rPr>
-            <w:lang w:val="en_US" w:bidi="en_US"/>
-          </w:rPr>
-          <w:rPr>
-            <w:color w:val="0000EE"/>
-            <w:u w:val="single"/>
-          </w:rPr>
-          <w:t>17:1</w:t>
-        </w:r>
-      </w:hyperlink>
-      <w:r>
-        <w:rPr>
-          <w:lang w:val="en_US" w:bidi="en_US"/>
-        </w:rPr>
-        <w:t xml:space="preserve">; </w:t>
-      </w:r>
-      <w:hyperlink r:id="rId292">
-        <w:r>
-          <w:rPr>
-            <w:lang w:val="en_US" w:bidi="en_US"/>
-          </w:rPr>
-          <w:rPr>
-            <w:color w:val="0000EE"/>
-            <w:u w:val="single"/>
-          </w:rPr>
-          <w:t>Amos 1:3–5</w:t>
-        </w:r>
-      </w:hyperlink>
-      <w:r>
-        <w:rPr>
-          <w:lang w:val="en_US" w:bidi="en_US"/>
-        </w:rPr>
-        <w:t>). Instead of trusting God, King Ahaz of Judah sought protection from the Assyrians. The Assyrians responded to his gifts by attacking Damascus and exiling its people in 733 and 732 BC (</w:t>
-      </w:r>
-      <w:hyperlink r:id="rId293">
-        <w:r>
-          <w:rPr>
-            <w:lang w:val="en_US" w:bidi="en_US"/>
-          </w:rPr>
-          <w:rPr>
-            <w:color w:val="0000EE"/>
-            <w:u w:val="single"/>
-          </w:rPr>
-          <w:t>2 Kings 16:7–11</w:t>
-        </w:r>
-      </w:hyperlink>
-      <w:r>
-        <w:rPr>
-          <w:lang w:val="en_US" w:bidi="en_US"/>
-        </w:rPr>
-        <w:t>). Damascus ceased to be an independent city-state.</w:t>
-      </w:r>
-    </w:p>
-    <w:p>
-      <w:pPr/>
-      <w:r>
-        <w:rPr>
-          <w:lang w:val="en_US" w:bidi="en_US"/>
-        </w:rPr>
-      </w:r>
-      <w:r>
-        <w:rPr>
-          <w:lang w:val="en_US" w:bidi="en_US"/>
-        </w:rPr>
-        <w:t xml:space="preserve">The Arameans' language, Aramaic, became the main language for diplomacy and administration across the Near East (see, for example, </w:t>
-      </w:r>
-      <w:hyperlink r:id="rId294">
-        <w:r>
-          <w:rPr>
-            <w:lang w:val="en_US" w:bidi="en_US"/>
-          </w:rPr>
-          <w:rPr>
-            <w:color w:val="0000EE"/>
-            <w:u w:val="single"/>
-          </w:rPr>
-          <w:t>2 Kings 18:26</w:t>
-        </w:r>
-      </w:hyperlink>
-      <w:r>
-        <w:rPr>
-          <w:lang w:val="en_US" w:bidi="en_US"/>
-        </w:rPr>
-        <w:t xml:space="preserve">). During the exile in Babylon, the Jews started using Aramaic; parts of Ezra and Daniel are in Aramaic. Aramaic was the common language from Egypt to India during the Persian period and was widely spoken in Palestine during Jesus' time (see </w:t>
-      </w:r>
-      <w:hyperlink r:id="rId295">
-        <w:r>
-          <w:rPr>
-            <w:lang w:val="en_US" w:bidi="en_US"/>
-          </w:rPr>
-          <w:rPr>
-            <w:color w:val="0000EE"/>
-            <w:u w:val="single"/>
-          </w:rPr>
-          <w:t>Mark 5:41</w:t>
-        </w:r>
-      </w:hyperlink>
-      <w:r>
-        <w:rPr>
-          <w:lang w:val="en_US" w:bidi="en_US"/>
-        </w:rPr>
-        <w:t xml:space="preserve">; </w:t>
-      </w:r>
-      <w:hyperlink r:id="rId296">
-        <w:r>
-          <w:rPr>
-            <w:lang w:val="en_US" w:bidi="en_US"/>
-          </w:rPr>
-          <w:rPr>
-            <w:color w:val="0000EE"/>
-            <w:u w:val="single"/>
-          </w:rPr>
-          <w:t>1 Corinthians 16:22</w:t>
+        <w:t>In the early days of Asa's reign, God gave him military victories and peace. Asa expelled or defeated anyone trying to conquer, divide, or destroy Judah (</w:t>
+      </w:r>
+      <w:hyperlink r:id="rId322">
+        <w:r>
+          <w:rPr>
+            <w:lang w:val="en_US" w:bidi="en_US"/>
+          </w:rPr>
+          <w:rPr>
+            <w:color w:val="0000EE"/>
+            <w:u w:val="single"/>
+          </w:rPr>
+          <w:t>2 Chronicles 14:1–8</w:t>
+        </w:r>
+      </w:hyperlink>
+      <w:r>
+        <w:rPr>
+          <w:lang w:val="en_US" w:bidi="en_US"/>
+        </w:rPr>
+        <w:t>). Asa's most remarkable victory was over an Ethiopian leader named Zerah, who attacked Judah with over a million troops. Due to Asa's obedience and faithfulness, God granted him a great victory (</w:t>
+      </w:r>
+      <w:hyperlink r:id="rId323">
+        <w:r>
+          <w:rPr>
+            <w:lang w:val="en_US" w:bidi="en_US"/>
+          </w:rPr>
+          <w:rPr>
+            <w:color w:val="0000EE"/>
+            <w:u w:val="single"/>
+          </w:rPr>
+          <w:t>2 Chronicles 14:9–15</w:t>
         </w:r>
       </w:hyperlink>
       <w:r>
@@ -7575,6 +8409,88 @@
       </w:r>
       <w:r>
         <w:rPr>
+          <w:lang w:val="en_US" w:bidi="en_US"/>
+        </w:rPr>
+        <w:t>Sadly, Asa's attitude changed near the end of his life. He stopped trusting in God. Baasha, the king of the northern kingdom, attacked Judah with help from Ben-hadad, king of Aram, and strengthened the city of Ramah. Asa paid the king of Aram to switch sides and support him instead of Baasha. This showed Asa trusted a foreign king more than the Lord. Worse, Asa paid Ben-hadad with gold and silver he had previously given to the temple! Asa's strategy worked, and the northern kingdom of Israel had to leave Judah to deal with Ben-hadad's threat from the north. However, the prophet Hanani criticized Asa for his lack of faith in God. Angered, Asa imprisoned Hanani (</w:t>
+      </w:r>
+      <w:hyperlink r:id="rId324">
+        <w:r>
+          <w:rPr>
+            <w:lang w:val="en_US" w:bidi="en_US"/>
+          </w:rPr>
+          <w:rPr>
+            <w:color w:val="0000EE"/>
+            <w:u w:val="single"/>
+          </w:rPr>
+          <w:t>2 Chronicles 16:7–10</w:t>
+        </w:r>
+      </w:hyperlink>
+      <w:r>
+        <w:rPr>
+          <w:lang w:val="en_US" w:bidi="en_US"/>
+        </w:rPr>
+        <w:t>).</w:t>
+      </w:r>
+    </w:p>
+    <w:p>
+      <w:pPr/>
+      <w:r>
+        <w:rPr>
+          <w:lang w:val="en_US" w:bidi="en_US"/>
+        </w:rPr>
+      </w:r>
+      <w:r>
+        <w:rPr>
+          <w:lang w:val="en_US" w:bidi="en_US"/>
+        </w:rPr>
+        <w:t>In the last years of his reign, Asa had a serious foot disease. Despite the severity of his illness, he did not seek the Lord's help. Instead, he relied only on his doctors (</w:t>
+      </w:r>
+      <w:hyperlink r:id="rId325">
+        <w:r>
+          <w:rPr>
+            <w:lang w:val="en_US" w:bidi="en_US"/>
+          </w:rPr>
+          <w:rPr>
+            <w:color w:val="0000EE"/>
+            <w:u w:val="single"/>
+          </w:rPr>
+          <w:t>2 Chronicles 16:12</w:t>
+        </w:r>
+      </w:hyperlink>
+      <w:r>
+        <w:rPr>
+          <w:lang w:val="en_US" w:bidi="en_US"/>
+        </w:rPr>
+        <w:t>). Even so, when Asa died, they buried him with honor in the royal tombs (</w:t>
+      </w:r>
+      <w:hyperlink r:id="rId326">
+        <w:r>
+          <w:rPr>
+            <w:lang w:val="en_US" w:bidi="en_US"/>
+          </w:rPr>
+          <w:rPr>
+            <w:color w:val="0000EE"/>
+            <w:u w:val="single"/>
+          </w:rPr>
+          <w:t>2 Chronicles 16:14</w:t>
+        </w:r>
+      </w:hyperlink>
+      <w:r>
+        <w:rPr>
+          <w:lang w:val="en_US" w:bidi="en_US"/>
+        </w:rPr>
+        <w:t>).</w:t>
+      </w:r>
+    </w:p>
+    <w:p>
+      <w:pPr/>
+      <w:r>
+        <w:rPr>
+          <w:lang w:val="en_US" w:bidi="en_US"/>
+        </w:rPr>
+      </w:r>
+      <w:r>
+        <w:rPr>
           <w:u w:val="single"/>
           <w:lang w:val="en_US" w:bidi="en_US"/>
         </w:rPr>
@@ -7588,268 +8504,34 @@
           <w:lang w:val="en_US" w:bidi="en_US"/>
         </w:rPr>
       </w:r>
-      <w:hyperlink r:id="rId270">
-        <w:r>
-          <w:rPr>
-            <w:lang w:val="en_US" w:bidi="en_US"/>
-          </w:rPr>
-          <w:rPr>
-            <w:color w:val="0000EE"/>
-            <w:u w:val="single"/>
-          </w:rPr>
-          <w:t>Genesis 10:22–23</w:t>
-        </w:r>
-      </w:hyperlink>
-      <w:r>
-        <w:rPr>
-          <w:lang w:val="en_US" w:bidi="en_US"/>
-        </w:rPr>
-        <w:t xml:space="preserve">; </w:t>
-      </w:r>
-      <w:hyperlink r:id="rId271">
-        <w:r>
-          <w:rPr>
-            <w:lang w:val="en_US" w:bidi="en_US"/>
-          </w:rPr>
-          <w:rPr>
-            <w:color w:val="0000EE"/>
-            <w:u w:val="single"/>
-          </w:rPr>
-          <w:t>22:20–21</w:t>
-        </w:r>
-      </w:hyperlink>
-      <w:r>
-        <w:rPr>
-          <w:lang w:val="en_US" w:bidi="en_US"/>
-        </w:rPr>
-        <w:t xml:space="preserve">; </w:t>
-      </w:r>
-      <w:hyperlink r:id="rId272">
-        <w:r>
-          <w:rPr>
-            <w:lang w:val="en_US" w:bidi="en_US"/>
-          </w:rPr>
-          <w:rPr>
-            <w:color w:val="0000EE"/>
-            <w:u w:val="single"/>
-          </w:rPr>
-          <w:t>25:20</w:t>
-        </w:r>
-      </w:hyperlink>
-      <w:r>
-        <w:rPr>
-          <w:lang w:val="en_US" w:bidi="en_US"/>
-        </w:rPr>
-        <w:t xml:space="preserve">; </w:t>
-      </w:r>
-      <w:hyperlink r:id="rId273">
-        <w:r>
-          <w:rPr>
-            <w:lang w:val="en_US" w:bidi="en_US"/>
-          </w:rPr>
-          <w:rPr>
-            <w:color w:val="0000EE"/>
-            <w:u w:val="single"/>
-          </w:rPr>
-          <w:t>28:1–7</w:t>
-        </w:r>
-      </w:hyperlink>
-      <w:r>
-        <w:rPr>
-          <w:lang w:val="en_US" w:bidi="en_US"/>
-        </w:rPr>
-        <w:t xml:space="preserve">; </w:t>
-      </w:r>
-      <w:hyperlink r:id="rId276">
-        <w:r>
-          <w:rPr>
-            <w:lang w:val="en_US" w:bidi="en_US"/>
-          </w:rPr>
-          <w:rPr>
-            <w:color w:val="0000EE"/>
-            <w:u w:val="single"/>
-          </w:rPr>
-          <w:t>Deuteronomy 26:5</w:t>
-        </w:r>
-      </w:hyperlink>
-      <w:r>
-        <w:rPr>
-          <w:lang w:val="en_US" w:bidi="en_US"/>
-        </w:rPr>
-        <w:t xml:space="preserve">; </w:t>
-      </w:r>
-      <w:hyperlink r:id="rId297">
-        <w:r>
-          <w:rPr>
-            <w:lang w:val="en_US" w:bidi="en_US"/>
-          </w:rPr>
-          <w:rPr>
-            <w:color w:val="0000EE"/>
-            <w:u w:val="single"/>
-          </w:rPr>
-          <w:t>2 Samuel 8:3–4</w:t>
-        </w:r>
-      </w:hyperlink>
-      <w:r>
-        <w:rPr>
-          <w:lang w:val="en_US" w:bidi="en_US"/>
-        </w:rPr>
-        <w:t xml:space="preserve">; </w:t>
-      </w:r>
-      <w:hyperlink r:id="rId298">
-        <w:r>
-          <w:rPr>
-            <w:lang w:val="en_US" w:bidi="en_US"/>
-          </w:rPr>
-          <w:rPr>
-            <w:color w:val="0000EE"/>
-            <w:u w:val="single"/>
-          </w:rPr>
-          <w:t>10:17–19</w:t>
-        </w:r>
-      </w:hyperlink>
-      <w:r>
-        <w:rPr>
-          <w:lang w:val="en_US" w:bidi="en_US"/>
-        </w:rPr>
-        <w:t xml:space="preserve">; </w:t>
-      </w:r>
-      <w:hyperlink r:id="rId299">
-        <w:r>
-          <w:rPr>
-            <w:lang w:val="en_US" w:bidi="en_US"/>
-          </w:rPr>
-          <w:rPr>
-            <w:color w:val="0000EE"/>
-            <w:u w:val="single"/>
-          </w:rPr>
-          <w:t>1 Kings 15:18</w:t>
-        </w:r>
-      </w:hyperlink>
-      <w:r>
-        <w:rPr>
-          <w:lang w:val="en_US" w:bidi="en_US"/>
-        </w:rPr>
-        <w:t xml:space="preserve">; </w:t>
-      </w:r>
-      <w:hyperlink r:id="rId222">
-        <w:r>
-          <w:rPr>
-            <w:lang w:val="en_US" w:bidi="en_US"/>
-          </w:rPr>
-          <w:rPr>
-            <w:color w:val="0000EE"/>
-            <w:u w:val="single"/>
-          </w:rPr>
-          <w:t>1 Kings 20:1–34</w:t>
-        </w:r>
-      </w:hyperlink>
-      <w:r>
-        <w:rPr>
-          <w:lang w:val="en_US" w:bidi="en_US"/>
-        </w:rPr>
-        <w:t xml:space="preserve">; </w:t>
-      </w:r>
-      <w:hyperlink r:id="rId282">
-        <w:r>
-          <w:rPr>
-            <w:lang w:val="en_US" w:bidi="en_US"/>
-          </w:rPr>
-          <w:rPr>
-            <w:color w:val="0000EE"/>
-            <w:u w:val="single"/>
-          </w:rPr>
-          <w:t>22:29–37</w:t>
-        </w:r>
-      </w:hyperlink>
-      <w:r>
-        <w:rPr>
-          <w:lang w:val="en_US" w:bidi="en_US"/>
-        </w:rPr>
-        <w:t xml:space="preserve">; </w:t>
-      </w:r>
-      <w:hyperlink r:id="rId300">
-        <w:r>
-          <w:rPr>
-            <w:lang w:val="en_US" w:bidi="en_US"/>
-          </w:rPr>
-          <w:rPr>
-            <w:color w:val="0000EE"/>
-            <w:u w:val="single"/>
-          </w:rPr>
-          <w:t>2 Kings 13:25</w:t>
-        </w:r>
-      </w:hyperlink>
-      <w:r>
-        <w:rPr>
-          <w:lang w:val="en_US" w:bidi="en_US"/>
-        </w:rPr>
-        <w:t xml:space="preserve">; </w:t>
-      </w:r>
-      <w:hyperlink r:id="rId301">
-        <w:r>
-          <w:rPr>
-            <w:lang w:val="en_US" w:bidi="en_US"/>
-          </w:rPr>
-          <w:rPr>
-            <w:color w:val="0000EE"/>
-            <w:u w:val="single"/>
-          </w:rPr>
-          <w:t>16:9–13</w:t>
-        </w:r>
-      </w:hyperlink>
-      <w:r>
-        <w:rPr>
-          <w:lang w:val="en_US" w:bidi="en_US"/>
-        </w:rPr>
-        <w:t xml:space="preserve">; </w:t>
-      </w:r>
-      <w:hyperlink r:id="rId302">
-        <w:r>
-          <w:rPr>
-            <w:lang w:val="en_US" w:bidi="en_US"/>
-          </w:rPr>
-          <w:rPr>
-            <w:color w:val="0000EE"/>
-            <w:u w:val="single"/>
-          </w:rPr>
-          <w:t>17:24–34</w:t>
-        </w:r>
-      </w:hyperlink>
-      <w:r>
-        <w:rPr>
-          <w:lang w:val="en_US" w:bidi="en_US"/>
-        </w:rPr>
-        <w:t xml:space="preserve">; </w:t>
-      </w:r>
-      <w:hyperlink r:id="rId275">
-        <w:r>
-          <w:rPr>
-            <w:lang w:val="en_US" w:bidi="en_US"/>
-          </w:rPr>
-          <w:rPr>
-            <w:color w:val="0000EE"/>
-            <w:u w:val="single"/>
-          </w:rPr>
-          <w:t>Hosea 12:12</w:t>
-        </w:r>
-      </w:hyperlink>
-      <w:r>
-        <w:rPr>
-          <w:lang w:val="en_US" w:bidi="en_US"/>
-        </w:rPr>
-        <w:t xml:space="preserve">; </w:t>
-      </w:r>
-      <w:hyperlink r:id="rId303">
-        <w:r>
-          <w:rPr>
-            <w:lang w:val="en_US" w:bidi="en_US"/>
-          </w:rPr>
-          <w:rPr>
-            <w:color w:val="0000EE"/>
-            <w:u w:val="single"/>
-          </w:rPr>
-          <w:t>Amos 1:5</w:t>
+      <w:hyperlink r:id="rId327">
+        <w:r>
+          <w:rPr>
+            <w:lang w:val="en_US" w:bidi="en_US"/>
+          </w:rPr>
+          <w:rPr>
+            <w:color w:val="0000EE"/>
+            <w:u w:val="single"/>
+          </w:rPr>
+          <w:t>1 Kings 15:8–24</w:t>
+        </w:r>
+      </w:hyperlink>
+      <w:r>
+        <w:rPr>
+          <w:lang w:val="en_US" w:bidi="en_US"/>
+        </w:rPr>
+        <w:t xml:space="preserve">; </w:t>
+      </w:r>
+      <w:hyperlink r:id="rId328">
+        <w:r>
+          <w:rPr>
+            <w:lang w:val="en_US" w:bidi="en_US"/>
+          </w:rPr>
+          <w:rPr>
+            <w:color w:val="0000EE"/>
+            <w:u w:val="single"/>
+          </w:rPr>
+          <w:t>2 Chronicles 14:1–16:14</w:t>
         </w:r>
       </w:hyperlink>
       <w:r>
@@ -7879,69 +8561,234 @@
         <w:rPr>
           <w:lang w:val="en_US" w:bidi="en_US"/>
         </w:rPr>
-        <w:t>Asa</w:t>
-      </w:r>
-      <w:r>
-        <w:rPr>
-          <w:lang w:val="en_US" w:bidi="en_US"/>
-        </w:rPr>
-      </w:r>
-    </w:p>
-    <w:p>
-      <w:pPr/>
-      <w:r>
-        <w:rPr>
-          <w:lang w:val="en_US" w:bidi="en_US"/>
-        </w:rPr>
-      </w:r>
-      <w:r>
-        <w:rPr>
-          <w:lang w:val="en_US" w:bidi="en_US"/>
-        </w:rPr>
-        <w:t>Asa became the third king of Judah after Solomon's empire split into separate kingdoms. Asa became king after his father, Abijah, who ruled briefly from 913 to 910 BC. Asa reigned for 41 years, from 910 to 869 BC.</w:t>
-      </w:r>
-    </w:p>
-    <w:p>
-      <w:pPr/>
-      <w:r>
-        <w:rPr>
-          <w:lang w:val="en_US" w:bidi="en_US"/>
-        </w:rPr>
-      </w:r>
-      <w:r>
-        <w:rPr>
-          <w:lang w:val="en_US" w:bidi="en_US"/>
-        </w:rPr>
-        <w:t>At the start of his reign, Asa was a good king. He opposed the worship of false gods, destroyed the Asherah pole his grandmother Maacah had set up, and removed her political influence (</w:t>
-      </w:r>
-      <w:hyperlink r:id="rId304">
-        <w:r>
-          <w:rPr>
-            <w:lang w:val="en_US" w:bidi="en_US"/>
-          </w:rPr>
-          <w:rPr>
-            <w:color w:val="0000EE"/>
-            <w:u w:val="single"/>
-          </w:rPr>
-          <w:t>1 Kings 15:13</w:t>
-        </w:r>
-      </w:hyperlink>
-      <w:r>
-        <w:rPr>
-          <w:lang w:val="en_US" w:bidi="en_US"/>
-        </w:rPr>
-        <w:t xml:space="preserve">; </w:t>
-      </w:r>
-      <w:hyperlink r:id="rId305">
-        <w:r>
-          <w:rPr>
-            <w:lang w:val="en_US" w:bidi="en_US"/>
-          </w:rPr>
-          <w:rPr>
-            <w:color w:val="0000EE"/>
-            <w:u w:val="single"/>
-          </w:rPr>
-          <w:t>2 Chronicles 15:16</w:t>
+        <w:t>Assyria</w:t>
+      </w:r>
+      <w:r>
+        <w:rPr>
+          <w:lang w:val="en_US" w:bidi="en_US"/>
+        </w:rPr>
+      </w:r>
+    </w:p>
+    <w:p>
+      <w:pPr/>
+      <w:r>
+        <w:rPr>
+          <w:lang w:val="en_US" w:bidi="en_US"/>
+        </w:rPr>
+      </w:r>
+      <w:r>
+        <w:rPr>
+          <w:lang w:val="en_US" w:bidi="en_US"/>
+        </w:rPr>
+        <w:t>Assyria was a symbol of fear and cruelty in the Near East for over three centuries. The Bible describes its power and harsh treatment of the people of Israel and Judah. However, Assyria's success depended on its leaders' strength. Eventually, stronger forces defeated it.</w:t>
+      </w:r>
+    </w:p>
+    <w:p>
+      <w:pPr>
+        <w:pStyle w:val="Heading4"/>
+      </w:pPr>
+      <w:r>
+        <w:rPr>
+          <w:lang w:val="en_US" w:bidi="en_US"/>
+        </w:rPr>
+        <w:t>Ashurnasirpal II (885–860 BC)</w:t>
+      </w:r>
+    </w:p>
+    <w:p>
+      <w:pPr/>
+      <w:r>
+        <w:rPr>
+          <w:lang w:val="en_US" w:bidi="en_US"/>
+        </w:rPr>
+      </w:r>
+      <w:r>
+        <w:rPr>
+          <w:lang w:val="en_US" w:bidi="en_US"/>
+        </w:rPr>
+        <w:t>Ashurnasirpal II had the same qualities and flaws as the kings who came after him but to a greater degree. He was ambitious, energetic, brave, vain, and magnificent. He was determined to expand his kingdom.</w:t>
+      </w:r>
+    </w:p>
+    <w:p>
+      <w:pPr>
+        <w:pStyle w:val="Heading4"/>
+      </w:pPr>
+      <w:r>
+        <w:rPr>
+          <w:lang w:val="en_US" w:bidi="en_US"/>
+        </w:rPr>
+        <w:t>Shalmaneser III (858–824 BC)</w:t>
+      </w:r>
+    </w:p>
+    <w:p>
+      <w:pPr/>
+      <w:r>
+        <w:rPr>
+          <w:lang w:val="en_US" w:bidi="en_US"/>
+        </w:rPr>
+      </w:r>
+      <w:r>
+        <w:rPr>
+          <w:lang w:val="en_US" w:bidi="en_US"/>
+        </w:rPr>
+        <w:t>Shalmaneser III is famous for the Battle of Qarqar in 853 BC, one of the best-documented events from ancient times. A group of allied kingdoms, including King Ahab of Israel and several other states, stopped his invasion of Syria. It took years before Shalmaneser conquered Israel and Syria. The Black Obelisk of Shalmaneser III shows King Jehu of Israel bowing and giving tribute (payment to show submission).</w:t>
+      </w:r>
+    </w:p>
+    <w:p>
+      <w:pPr>
+        <w:pStyle w:val="Heading4"/>
+      </w:pPr>
+      <w:r>
+        <w:rPr>
+          <w:lang w:val="en_US" w:bidi="en_US"/>
+        </w:rPr>
+        <w:t>Repentance during the Time of Jonah</w:t>
+      </w:r>
+    </w:p>
+    <w:p>
+      <w:pPr/>
+      <w:r>
+        <w:rPr>
+          <w:lang w:val="en_US" w:bidi="en_US"/>
+        </w:rPr>
+      </w:r>
+      <w:r>
+        <w:rPr>
+          <w:lang w:val="en_US" w:bidi="en_US"/>
+        </w:rPr>
+        <w:t>During King Jeroboam II's reign in Israel from 793 to 753 BC, the prophet Jonah reluctantly traveled to Nineveh to announce judgment (</w:t>
+      </w:r>
+      <w:hyperlink r:id="rId329">
+        <w:r>
+          <w:rPr>
+            <w:lang w:val="en_US" w:bidi="en_US"/>
+          </w:rPr>
+          <w:rPr>
+            <w:color w:val="0000EE"/>
+            <w:u w:val="single"/>
+          </w:rPr>
+          <w:t>Jonah 3–4</w:t>
+        </w:r>
+      </w:hyperlink>
+      <w:r>
+        <w:rPr>
+          <w:lang w:val="en_US" w:bidi="en_US"/>
+        </w:rPr>
+        <w:t>). Assyria was declining at that time. As Jonah feared, the king and people of Nineveh listened and repented of their sins. As a result, God gave them a reprieve that lasted about 150 years.</w:t>
+      </w:r>
+    </w:p>
+    <w:p>
+      <w:pPr>
+        <w:pStyle w:val="Heading4"/>
+      </w:pPr>
+      <w:r>
+        <w:rPr>
+          <w:lang w:val="en_US" w:bidi="en_US"/>
+        </w:rPr>
+        <w:t>Tiglath-pileser III (744–727 BC)</w:t>
+      </w:r>
+    </w:p>
+    <w:p>
+      <w:pPr/>
+      <w:r>
+        <w:rPr>
+          <w:lang w:val="en_US" w:bidi="en_US"/>
+        </w:rPr>
+      </w:r>
+      <w:r>
+        <w:rPr>
+          <w:lang w:val="en_US" w:bidi="en_US"/>
+        </w:rPr>
+        <w:t>Tiglath-pileser III took over the Assyrian throne and worked to regain and strengthen control over all Assyrian territories. He also became the king of Babylon, making Assyria the leading military and economic power in the Near East. He showed political wisdom uncommon among the typically ruthless Assyrian kings. King Menahem of Israel, who ruled 752 from 742 BC, paid him tribute (</w:t>
+      </w:r>
+      <w:hyperlink r:id="rId330">
+        <w:r>
+          <w:rPr>
+            <w:lang w:val="en_US" w:bidi="en_US"/>
+          </w:rPr>
+          <w:rPr>
+            <w:color w:val="0000EE"/>
+            <w:u w:val="single"/>
+          </w:rPr>
+          <w:t>2 Kings 15:19–20</w:t>
+        </w:r>
+      </w:hyperlink>
+      <w:r>
+        <w:rPr>
+          <w:lang w:val="en_US" w:bidi="en_US"/>
+        </w:rPr>
+        <w:t>), as did Tyre, Byblos, and Damascus. When King Ahaz of Judah, who ruled from 735 to 715 BC, asked for help against Syria and Israel (</w:t>
+      </w:r>
+      <w:hyperlink r:id="rId331">
+        <w:r>
+          <w:rPr>
+            <w:lang w:val="en_US" w:bidi="en_US"/>
+          </w:rPr>
+          <w:rPr>
+            <w:color w:val="0000EE"/>
+            <w:u w:val="single"/>
+          </w:rPr>
+          <w:t>2 Kings 16:5–20</w:t>
+        </w:r>
+      </w:hyperlink>
+      <w:r>
+        <w:rPr>
+          <w:lang w:val="en_US" w:bidi="en_US"/>
+        </w:rPr>
+        <w:t>), Tiglath-pileser conquered Damascus in 732 BC. Shalmaneser V, who became king after Tiglath-pileser, would destroy Samaria in 722 BC. This would mark the end of the northern kingdom of Israel.</w:t>
+      </w:r>
+    </w:p>
+    <w:p>
+      <w:pPr>
+        <w:pStyle w:val="Heading4"/>
+      </w:pPr>
+      <w:r>
+        <w:rPr>
+          <w:lang w:val="en_US" w:bidi="en_US"/>
+        </w:rPr>
+        <w:t>Sennacherib (705–681 BC)</w:t>
+      </w:r>
+    </w:p>
+    <w:p>
+      <w:pPr/>
+      <w:r>
+        <w:rPr>
+          <w:lang w:val="en_US" w:bidi="en_US"/>
+        </w:rPr>
+      </w:r>
+      <w:r>
+        <w:rPr>
+          <w:lang w:val="en_US" w:bidi="en_US"/>
+        </w:rPr>
+        <w:t>Sennacherib spent his reign fighting many difficult wars. He is well-known in the Bible for attacking Judah and surrounding Jerusalem in 701 BC. This happened during King Hezekiah's rule and the prophet Isaiah's time (</w:t>
+      </w:r>
+      <w:hyperlink r:id="rId332">
+        <w:r>
+          <w:rPr>
+            <w:lang w:val="en_US" w:bidi="en_US"/>
+          </w:rPr>
+          <w:rPr>
+            <w:color w:val="0000EE"/>
+            <w:u w:val="single"/>
+          </w:rPr>
+          <w:t>2 Kings 18:13–19:37</w:t>
+        </w:r>
+      </w:hyperlink>
+      <w:r>
+        <w:rPr>
+          <w:lang w:val="en_US" w:bidi="en_US"/>
+        </w:rPr>
+        <w:t xml:space="preserve">; </w:t>
+      </w:r>
+      <w:hyperlink r:id="rId333">
+        <w:r>
+          <w:rPr>
+            <w:lang w:val="en_US" w:bidi="en_US"/>
+          </w:rPr>
+          <w:rPr>
+            <w:color w:val="0000EE"/>
+            <w:u w:val="single"/>
+          </w:rPr>
+          <w:t>Isaiah 36–37</w:t>
         </w:r>
       </w:hyperlink>
       <w:r>
@@ -7952,135 +8799,89 @@
       </w:r>
     </w:p>
     <w:p>
-      <w:pPr/>
-      <w:r>
-        <w:rPr>
-          <w:lang w:val="en_US" w:bidi="en_US"/>
-        </w:rPr>
-      </w:r>
-      <w:r>
-        <w:rPr>
-          <w:lang w:val="en_US" w:bidi="en_US"/>
-        </w:rPr>
-        <w:t>In the early days of Asa's reign, God gave him military victories and peace. Asa expelled or defeated anyone trying to conquer, divide, or destroy Judah (</w:t>
-      </w:r>
-      <w:hyperlink r:id="rId306">
-        <w:r>
-          <w:rPr>
-            <w:lang w:val="en_US" w:bidi="en_US"/>
-          </w:rPr>
-          <w:rPr>
-            <w:color w:val="0000EE"/>
-            <w:u w:val="single"/>
-          </w:rPr>
-          <w:t>2 Chronicles 14:1–8</w:t>
-        </w:r>
-      </w:hyperlink>
-      <w:r>
-        <w:rPr>
-          <w:lang w:val="en_US" w:bidi="en_US"/>
-        </w:rPr>
-        <w:t>). Asa's most remarkable victory was over an Ethiopian leader named Zerah, who attacked Judah with over a million troops. Due to Asa's obedience and faithfulness, God granted him a great victory (</w:t>
-      </w:r>
-      <w:hyperlink r:id="rId307">
-        <w:r>
-          <w:rPr>
-            <w:lang w:val="en_US" w:bidi="en_US"/>
-          </w:rPr>
-          <w:rPr>
-            <w:color w:val="0000EE"/>
-            <w:u w:val="single"/>
-          </w:rPr>
-          <w:t>2 Chronicles 14:9–15</w:t>
-        </w:r>
-      </w:hyperlink>
-      <w:r>
-        <w:rPr>
-          <w:lang w:val="en_US" w:bidi="en_US"/>
-        </w:rPr>
-        <w:t>).</w:t>
-      </w:r>
-    </w:p>
-    <w:p>
-      <w:pPr/>
-      <w:r>
-        <w:rPr>
-          <w:lang w:val="en_US" w:bidi="en_US"/>
-        </w:rPr>
-      </w:r>
-      <w:r>
-        <w:rPr>
-          <w:lang w:val="en_US" w:bidi="en_US"/>
-        </w:rPr>
-        <w:t>Sadly, Asa's attitude changed near the end of his life. He stopped trusting in God. Baasha, the king of the northern kingdom, attacked Judah with help from Ben-hadad, king of Aram, and strengthened the city of Ramah. Asa paid the king of Aram to switch sides and support him instead of Baasha. This showed Asa trusted a foreign king more than the Lord. Worse, Asa paid Ben-hadad with gold and silver he had previously given to the temple! Asa's strategy worked, and the northern kingdom of Israel had to leave Judah to deal with Ben-hadad's threat from the north. However, the prophet Hanani criticized Asa for his lack of faith in God. Angered, Asa imprisoned Hanani (</w:t>
-      </w:r>
-      <w:hyperlink r:id="rId308">
-        <w:r>
-          <w:rPr>
-            <w:lang w:val="en_US" w:bidi="en_US"/>
-          </w:rPr>
-          <w:rPr>
-            <w:color w:val="0000EE"/>
-            <w:u w:val="single"/>
-          </w:rPr>
-          <w:t>2 Chronicles 16:7–10</w:t>
-        </w:r>
-      </w:hyperlink>
-      <w:r>
-        <w:rPr>
-          <w:lang w:val="en_US" w:bidi="en_US"/>
-        </w:rPr>
-        <w:t>).</w:t>
-      </w:r>
-    </w:p>
-    <w:p>
-      <w:pPr/>
-      <w:r>
-        <w:rPr>
-          <w:lang w:val="en_US" w:bidi="en_US"/>
-        </w:rPr>
-      </w:r>
-      <w:r>
-        <w:rPr>
-          <w:lang w:val="en_US" w:bidi="en_US"/>
-        </w:rPr>
-        <w:t>In the last years of his reign, Asa had a serious foot disease. Despite the severity of his illness, he did not seek the Lord's help. Instead, he relied only on his doctors (</w:t>
-      </w:r>
-      <w:hyperlink r:id="rId309">
-        <w:r>
-          <w:rPr>
-            <w:lang w:val="en_US" w:bidi="en_US"/>
-          </w:rPr>
-          <w:rPr>
-            <w:color w:val="0000EE"/>
-            <w:u w:val="single"/>
-          </w:rPr>
-          <w:t>2 Chronicles 16:12</w:t>
-        </w:r>
-      </w:hyperlink>
-      <w:r>
-        <w:rPr>
-          <w:lang w:val="en_US" w:bidi="en_US"/>
-        </w:rPr>
-        <w:t>). Even so, when Asa died, they buried him with honor in the royal tombs (</w:t>
-      </w:r>
-      <w:hyperlink r:id="rId310">
-        <w:r>
-          <w:rPr>
-            <w:lang w:val="en_US" w:bidi="en_US"/>
-          </w:rPr>
-          <w:rPr>
-            <w:color w:val="0000EE"/>
-            <w:u w:val="single"/>
-          </w:rPr>
-          <w:t>2 Chronicles 16:14</w:t>
-        </w:r>
-      </w:hyperlink>
-      <w:r>
-        <w:rPr>
-          <w:lang w:val="en_US" w:bidi="en_US"/>
-        </w:rPr>
-        <w:t>).</w:t>
+      <w:pPr>
+        <w:pStyle w:val="Heading4"/>
+      </w:pPr>
+      <w:r>
+        <w:rPr>
+          <w:lang w:val="en_US" w:bidi="en_US"/>
+        </w:rPr>
+        <w:t>Ashurbanipal (668–627 BC)</w:t>
+      </w:r>
+    </w:p>
+    <w:p>
+      <w:pPr/>
+      <w:r>
+        <w:rPr>
+          <w:lang w:val="en_US" w:bidi="en_US"/>
+        </w:rPr>
+      </w:r>
+      <w:r>
+        <w:rPr>
+          <w:lang w:val="en_US" w:bidi="en_US"/>
+        </w:rPr>
+        <w:t xml:space="preserve">Ashurbanipal captured No-amon (Thebes) in Egypt, achieving the greatest victory in Assyrian history (see </w:t>
+      </w:r>
+      <w:hyperlink r:id="rId334">
+        <w:r>
+          <w:rPr>
+            <w:lang w:val="en_US" w:bidi="en_US"/>
+          </w:rPr>
+          <w:rPr>
+            <w:color w:val="0000EE"/>
+            <w:u w:val="single"/>
+          </w:rPr>
+          <w:t>Nahum 3:3–10</w:t>
+        </w:r>
+      </w:hyperlink>
+      <w:r>
+        <w:rPr>
+          <w:lang w:val="en_US" w:bidi="en_US"/>
+        </w:rPr>
+        <w:t>). He also established a large library in Nineveh, which was excavated in 1860. Many tablets were found, containing a wide range of Akkadian material. This library is now one of the main treasures of the British Museum in London. Very little is known about Ashurbanipal’s reign after 639 BC, as his records do not go beyond that year. However, hints in state correspondence, business documents, and prayers to the gods suggest that Assyria was becoming more unstable. When Ashurbanipal died in 627 BC, his empire declined quickly.</w:t>
+      </w:r>
+    </w:p>
+    <w:p>
+      <w:pPr>
+        <w:pStyle w:val="Heading4"/>
+      </w:pPr>
+      <w:r>
+        <w:rPr>
+          <w:lang w:val="en_US" w:bidi="en_US"/>
+        </w:rPr>
+        <w:t>Final Decline and Destruction</w:t>
+      </w:r>
+    </w:p>
+    <w:p>
+      <w:pPr/>
+      <w:r>
+        <w:rPr>
+          <w:lang w:val="en_US" w:bidi="en_US"/>
+        </w:rPr>
+      </w:r>
+      <w:r>
+        <w:rPr>
+          <w:lang w:val="en_US" w:bidi="en_US"/>
+        </w:rPr>
+        <w:t xml:space="preserve">In 626 BC, Nabopolassar became king of Babylon, ruled from 626 to 605 BC, and allied with the Medes. This alliance made Babylon's success against Assyria almost certain. In 612 BC, their combined forces launched a final attack on Nineveh. After a three-month siege, the mighty city fell (see </w:t>
+      </w:r>
+      <w:hyperlink r:id="rId335">
+        <w:r>
+          <w:rPr>
+            <w:lang w:val="en_US" w:bidi="en_US"/>
+          </w:rPr>
+          <w:rPr>
+            <w:color w:val="0000EE"/>
+            <w:u w:val="single"/>
+          </w:rPr>
+          <w:t>Nahum 1:8</w:t>
+        </w:r>
+      </w:hyperlink>
+      <w:r>
+        <w:rPr>
+          <w:lang w:val="en_US" w:bidi="en_US"/>
+        </w:rPr>
+        <w:t>). Nebuchadnezzar, then a general in his father’s army, completely destroyed the last Assyrian forces at the Battle of Carchemish in 605 BC.</w:t>
       </w:r>
     </w:p>
     <w:p>
@@ -8105,409 +8906,7 @@
           <w:lang w:val="en_US" w:bidi="en_US"/>
         </w:rPr>
       </w:r>
-      <w:hyperlink r:id="rId311">
-        <w:r>
-          <w:rPr>
-            <w:lang w:val="en_US" w:bidi="en_US"/>
-          </w:rPr>
-          <w:rPr>
-            <w:color w:val="0000EE"/>
-            <w:u w:val="single"/>
-          </w:rPr>
-          <w:t>1 Kings 15:8–24</w:t>
-        </w:r>
-      </w:hyperlink>
-      <w:r>
-        <w:rPr>
-          <w:lang w:val="en_US" w:bidi="en_US"/>
-        </w:rPr>
-        <w:t xml:space="preserve">; </w:t>
-      </w:r>
-      <w:hyperlink r:id="rId312">
-        <w:r>
-          <w:rPr>
-            <w:lang w:val="en_US" w:bidi="en_US"/>
-          </w:rPr>
-          <w:rPr>
-            <w:color w:val="0000EE"/>
-            <w:u w:val="single"/>
-          </w:rPr>
-          <w:t>2 Chronicles 14:1–16:14</w:t>
-        </w:r>
-      </w:hyperlink>
-      <w:r>
-        <w:rPr>
-          <w:lang w:val="en_US" w:bidi="en_US"/>
-        </w:rPr>
-      </w:r>
-      <w:r>
-        <w:rPr>
-          <w:lang w:val="en_US" w:bidi="en_US"/>
-        </w:rPr>
-      </w:r>
-    </w:p>
-    <w:p>
-      <w:pPr/>
-      <w:r>
-        <w:rPr>
-          <w:lang w:val="en_US" w:bidi="en_US"/>
-        </w:rPr>
-      </w:r>
-    </w:p>
-    <w:p>
-      <w:pPr>
-        <w:pStyle w:val="Heading2"/>
-      </w:pPr>
-      <w:r>
-        <w:rPr>
-          <w:lang w:val="en_US" w:bidi="en_US"/>
-        </w:rPr>
-        <w:t>Assyria</w:t>
-      </w:r>
-      <w:r>
-        <w:rPr>
-          <w:lang w:val="en_US" w:bidi="en_US"/>
-        </w:rPr>
-      </w:r>
-    </w:p>
-    <w:p>
-      <w:pPr/>
-      <w:r>
-        <w:rPr>
-          <w:lang w:val="en_US" w:bidi="en_US"/>
-        </w:rPr>
-      </w:r>
-      <w:r>
-        <w:rPr>
-          <w:lang w:val="en_US" w:bidi="en_US"/>
-        </w:rPr>
-        <w:t>Assyria was a symbol of fear and cruelty in the Near East for over three centuries. The Bible describes its power and harsh treatment of the people of Israel and Judah. However, Assyria's success depended on its leaders' strength. Eventually, stronger forces defeated it.</w:t>
-      </w:r>
-    </w:p>
-    <w:p>
-      <w:pPr>
-        <w:pStyle w:val="Heading4"/>
-      </w:pPr>
-      <w:r>
-        <w:rPr>
-          <w:lang w:val="en_US" w:bidi="en_US"/>
-        </w:rPr>
-        <w:t>Ashurnasirpal II (885–860 BC)</w:t>
-      </w:r>
-    </w:p>
-    <w:p>
-      <w:pPr/>
-      <w:r>
-        <w:rPr>
-          <w:lang w:val="en_US" w:bidi="en_US"/>
-        </w:rPr>
-      </w:r>
-      <w:r>
-        <w:rPr>
-          <w:lang w:val="en_US" w:bidi="en_US"/>
-        </w:rPr>
-        <w:t>Ashurnasirpal II had the same qualities and flaws as the kings who came after him but to a greater degree. He was ambitious, energetic, brave, vain, and magnificent. He was determined to expand his kingdom.</w:t>
-      </w:r>
-    </w:p>
-    <w:p>
-      <w:pPr>
-        <w:pStyle w:val="Heading4"/>
-      </w:pPr>
-      <w:r>
-        <w:rPr>
-          <w:lang w:val="en_US" w:bidi="en_US"/>
-        </w:rPr>
-        <w:t>Shalmaneser III (858–824 BC)</w:t>
-      </w:r>
-    </w:p>
-    <w:p>
-      <w:pPr/>
-      <w:r>
-        <w:rPr>
-          <w:lang w:val="en_US" w:bidi="en_US"/>
-        </w:rPr>
-      </w:r>
-      <w:r>
-        <w:rPr>
-          <w:lang w:val="en_US" w:bidi="en_US"/>
-        </w:rPr>
-        <w:t>Shalmaneser III is famous for the Battle of Qarqar in 853 BC, one of the best-documented events from ancient times. A group of allied kingdoms, including King Ahab of Israel and several other states, stopped his invasion of Syria. It took years before Shalmaneser conquered Israel and Syria. The Black Obelisk of Shalmaneser III shows King Jehu of Israel bowing and giving tribute (payment to show submission).</w:t>
-      </w:r>
-    </w:p>
-    <w:p>
-      <w:pPr>
-        <w:pStyle w:val="Heading4"/>
-      </w:pPr>
-      <w:r>
-        <w:rPr>
-          <w:lang w:val="en_US" w:bidi="en_US"/>
-        </w:rPr>
-        <w:t>Repentance during the Time of Jonah</w:t>
-      </w:r>
-    </w:p>
-    <w:p>
-      <w:pPr/>
-      <w:r>
-        <w:rPr>
-          <w:lang w:val="en_US" w:bidi="en_US"/>
-        </w:rPr>
-      </w:r>
-      <w:r>
-        <w:rPr>
-          <w:lang w:val="en_US" w:bidi="en_US"/>
-        </w:rPr>
-        <w:t>During King Jeroboam II's reign in Israel from 793 to 753 BC, the prophet Jonah reluctantly traveled to Nineveh to announce judgment (</w:t>
-      </w:r>
-      <w:hyperlink r:id="rId313">
-        <w:r>
-          <w:rPr>
-            <w:lang w:val="en_US" w:bidi="en_US"/>
-          </w:rPr>
-          <w:rPr>
-            <w:color w:val="0000EE"/>
-            <w:u w:val="single"/>
-          </w:rPr>
-          <w:t>Jonah 3–4</w:t>
-        </w:r>
-      </w:hyperlink>
-      <w:r>
-        <w:rPr>
-          <w:lang w:val="en_US" w:bidi="en_US"/>
-        </w:rPr>
-        <w:t>). Assyria was declining at that time. As Jonah feared, the king and people of Nineveh listened and repented of their sins. As a result, God gave them a reprieve that lasted about 150 years.</w:t>
-      </w:r>
-    </w:p>
-    <w:p>
-      <w:pPr>
-        <w:pStyle w:val="Heading4"/>
-      </w:pPr>
-      <w:r>
-        <w:rPr>
-          <w:lang w:val="en_US" w:bidi="en_US"/>
-        </w:rPr>
-        <w:t>Tiglath-pileser III (744–727 BC)</w:t>
-      </w:r>
-    </w:p>
-    <w:p>
-      <w:pPr/>
-      <w:r>
-        <w:rPr>
-          <w:lang w:val="en_US" w:bidi="en_US"/>
-        </w:rPr>
-      </w:r>
-      <w:r>
-        <w:rPr>
-          <w:lang w:val="en_US" w:bidi="en_US"/>
-        </w:rPr>
-        <w:t>Tiglath-pileser III took over the Assyrian throne and worked to regain and strengthen control over all Assyrian territories. He also became the king of Babylon, making Assyria the leading military and economic power in the Near East. He showed political wisdom uncommon among the typically ruthless Assyrian kings. King Menahem of Israel, who ruled 752 from 742 BC, paid him tribute (</w:t>
-      </w:r>
-      <w:hyperlink r:id="rId314">
-        <w:r>
-          <w:rPr>
-            <w:lang w:val="en_US" w:bidi="en_US"/>
-          </w:rPr>
-          <w:rPr>
-            <w:color w:val="0000EE"/>
-            <w:u w:val="single"/>
-          </w:rPr>
-          <w:t>2 Kings 15:19–20</w:t>
-        </w:r>
-      </w:hyperlink>
-      <w:r>
-        <w:rPr>
-          <w:lang w:val="en_US" w:bidi="en_US"/>
-        </w:rPr>
-        <w:t>), as did Tyre, Byblos, and Damascus. When King Ahaz of Judah, who ruled from 735 to 715 BC, asked for help against Syria and Israel (</w:t>
-      </w:r>
-      <w:hyperlink r:id="rId315">
-        <w:r>
-          <w:rPr>
-            <w:lang w:val="en_US" w:bidi="en_US"/>
-          </w:rPr>
-          <w:rPr>
-            <w:color w:val="0000EE"/>
-            <w:u w:val="single"/>
-          </w:rPr>
-          <w:t>2 Kings 16:5–20</w:t>
-        </w:r>
-      </w:hyperlink>
-      <w:r>
-        <w:rPr>
-          <w:lang w:val="en_US" w:bidi="en_US"/>
-        </w:rPr>
-        <w:t>), Tiglath-pileser conquered Damascus in 732 BC. Shalmaneser V, who became king after Tiglath-pileser, would destroy Samaria in 722 BC. This would mark the end of the northern kingdom of Israel.</w:t>
-      </w:r>
-    </w:p>
-    <w:p>
-      <w:pPr>
-        <w:pStyle w:val="Heading4"/>
-      </w:pPr>
-      <w:r>
-        <w:rPr>
-          <w:lang w:val="en_US" w:bidi="en_US"/>
-        </w:rPr>
-        <w:t>Sennacherib (705–681 BC)</w:t>
-      </w:r>
-    </w:p>
-    <w:p>
-      <w:pPr/>
-      <w:r>
-        <w:rPr>
-          <w:lang w:val="en_US" w:bidi="en_US"/>
-        </w:rPr>
-      </w:r>
-      <w:r>
-        <w:rPr>
-          <w:lang w:val="en_US" w:bidi="en_US"/>
-        </w:rPr>
-        <w:t>Sennacherib spent his reign fighting many difficult wars. He is well-known in the Bible for attacking Judah and surrounding Jerusalem in 701 BC. This happened during King Hezekiah's rule and the prophet Isaiah's time (</w:t>
-      </w:r>
-      <w:hyperlink r:id="rId316">
-        <w:r>
-          <w:rPr>
-            <w:lang w:val="en_US" w:bidi="en_US"/>
-          </w:rPr>
-          <w:rPr>
-            <w:color w:val="0000EE"/>
-            <w:u w:val="single"/>
-          </w:rPr>
-          <w:t>2 Kings 18:13–19:37</w:t>
-        </w:r>
-      </w:hyperlink>
-      <w:r>
-        <w:rPr>
-          <w:lang w:val="en_US" w:bidi="en_US"/>
-        </w:rPr>
-        <w:t xml:space="preserve">; </w:t>
-      </w:r>
-      <w:hyperlink r:id="rId317">
-        <w:r>
-          <w:rPr>
-            <w:lang w:val="en_US" w:bidi="en_US"/>
-          </w:rPr>
-          <w:rPr>
-            <w:color w:val="0000EE"/>
-            <w:u w:val="single"/>
-          </w:rPr>
-          <w:t>Isaiah 36–37</w:t>
-        </w:r>
-      </w:hyperlink>
-      <w:r>
-        <w:rPr>
-          <w:lang w:val="en_US" w:bidi="en_US"/>
-        </w:rPr>
-        <w:t>).</w:t>
-      </w:r>
-    </w:p>
-    <w:p>
-      <w:pPr>
-        <w:pStyle w:val="Heading4"/>
-      </w:pPr>
-      <w:r>
-        <w:rPr>
-          <w:lang w:val="en_US" w:bidi="en_US"/>
-        </w:rPr>
-        <w:t>Ashurbanipal (668–627 BC)</w:t>
-      </w:r>
-    </w:p>
-    <w:p>
-      <w:pPr/>
-      <w:r>
-        <w:rPr>
-          <w:lang w:val="en_US" w:bidi="en_US"/>
-        </w:rPr>
-      </w:r>
-      <w:r>
-        <w:rPr>
-          <w:lang w:val="en_US" w:bidi="en_US"/>
-        </w:rPr>
-        <w:t xml:space="preserve">Ashurbanipal captured No-amon (Thebes) in Egypt, achieving the greatest victory in Assyrian history (see </w:t>
-      </w:r>
-      <w:hyperlink r:id="rId318">
-        <w:r>
-          <w:rPr>
-            <w:lang w:val="en_US" w:bidi="en_US"/>
-          </w:rPr>
-          <w:rPr>
-            <w:color w:val="0000EE"/>
-            <w:u w:val="single"/>
-          </w:rPr>
-          <w:t>Nahum 3:3–10</w:t>
-        </w:r>
-      </w:hyperlink>
-      <w:r>
-        <w:rPr>
-          <w:lang w:val="en_US" w:bidi="en_US"/>
-        </w:rPr>
-        <w:t>). He also established a large library in Nineveh, which was excavated in 1860. Many tablets were found, containing a wide range of Akkadian material. This library is now one of the main treasures of the British Museum in London. Very little is known about Ashurbanipal’s reign after 639 BC, as his records do not go beyond that year. However, hints in state correspondence, business documents, and prayers to the gods suggest that Assyria was becoming more unstable. When Ashurbanipal died in 627 BC, his empire declined quickly.</w:t>
-      </w:r>
-    </w:p>
-    <w:p>
-      <w:pPr>
-        <w:pStyle w:val="Heading4"/>
-      </w:pPr>
-      <w:r>
-        <w:rPr>
-          <w:lang w:val="en_US" w:bidi="en_US"/>
-        </w:rPr>
-        <w:t>Final Decline and Destruction</w:t>
-      </w:r>
-    </w:p>
-    <w:p>
-      <w:pPr/>
-      <w:r>
-        <w:rPr>
-          <w:lang w:val="en_US" w:bidi="en_US"/>
-        </w:rPr>
-      </w:r>
-      <w:r>
-        <w:rPr>
-          <w:lang w:val="en_US" w:bidi="en_US"/>
-        </w:rPr>
-        <w:t xml:space="preserve">In 626 BC, Nabopolassar became king of Babylon, ruled from 626 to 605 BC, and allied with the Medes. This alliance made Babylon's success against Assyria almost certain. In 612 BC, their combined forces launched a final attack on Nineveh. After a three-month siege, the mighty city fell (see </w:t>
-      </w:r>
-      <w:hyperlink r:id="rId319">
-        <w:r>
-          <w:rPr>
-            <w:lang w:val="en_US" w:bidi="en_US"/>
-          </w:rPr>
-          <w:rPr>
-            <w:color w:val="0000EE"/>
-            <w:u w:val="single"/>
-          </w:rPr>
-          <w:t>Nahum 1:8</w:t>
-        </w:r>
-      </w:hyperlink>
-      <w:r>
-        <w:rPr>
-          <w:lang w:val="en_US" w:bidi="en_US"/>
-        </w:rPr>
-        <w:t>). Nebuchadnezzar, then a general in his father’s army, completely destroyed the last Assyrian forces at the Battle of Carchemish in 605 BC.</w:t>
-      </w:r>
-    </w:p>
-    <w:p>
-      <w:pPr/>
-      <w:r>
-        <w:rPr>
-          <w:lang w:val="en_US" w:bidi="en_US"/>
-        </w:rPr>
-      </w:r>
-      <w:r>
-        <w:rPr>
-          <w:u w:val="single"/>
-          <w:lang w:val="en_US" w:bidi="en_US"/>
-        </w:rPr>
-        <w:t>Passages for Further Study</w:t>
-      </w:r>
-    </w:p>
-    <w:p>
-      <w:pPr/>
-      <w:r>
-        <w:rPr>
-          <w:lang w:val="en_US" w:bidi="en_US"/>
-        </w:rPr>
-      </w:r>
-      <w:hyperlink r:id="rId320">
+      <w:hyperlink r:id="rId336">
         <w:r>
           <w:rPr>
             <w:lang w:val="en_US" w:bidi="en_US"/>

</xml_diff>

<commit_message>
Update Bible resource content and metadata for multiple languages for 2026-06-12 release
</commit_message>
<xml_diff>
--- a/eng/docx/001.content.docx
+++ b/eng/docx/001.content.docx
@@ -231,7 +231,7 @@
         <w:rPr>
           <w:lang w:val="en_US" w:bidi="en_US"/>
         </w:rPr>
-        <w:t xml:space="preserve">Aaron was Moses' older brother (see </w:t>
+        <w:t xml:space="preserve">Aaron was the older brother of Moses (see </w:t>
       </w:r>
       <w:hyperlink r:id="rId13">
         <w:r>
@@ -267,7 +267,7 @@
         <w:rPr>
           <w:lang w:val="en_US" w:bidi="en_US"/>
         </w:rPr>
-        <w:t>). He played an important role in establishing Israel and its institutions, especially the priesthood. He first appears after Moses' calling at the burning bush (</w:t>
+        <w:t>). He played an important role in establishing Israel and its institutions, especially the priesthood. He first appears after Moses was called by God at the burning bush (</w:t>
       </w:r>
       <w:hyperlink r:id="rId15">
         <w:r>
@@ -453,7 +453,7 @@
         <w:rPr>
           <w:lang w:val="en_US" w:bidi="en_US"/>
         </w:rPr>
-        <w:t>Aaron and his sister, Miriam, once wrongly questioned Moses' authority. This led to Miriam temporarily having leprosy (</w:t>
+        <w:t>Aaron and his sister, Miriam, once wrongly questioned the authority of Moses. This led to Miriam temporarily having leprosy (</w:t>
       </w:r>
       <w:hyperlink r:id="rId23">
         <w:r>
@@ -6439,7 +6439,7 @@
         <w:rPr>
           <w:lang w:val="en_US" w:bidi="en_US"/>
         </w:rPr>
-        <w:t>Annas and Caiaphas were both high priests during Jesus' time. They played key roles in condemning Jesus to death.</w:t>
+        <w:t>Annas and Caiaphas were both high priests during the time of Jesus. They played key roles in condemning Jesus to death.</w:t>
       </w:r>
     </w:p>
     <w:p>
@@ -6557,7 +6557,7 @@
         <w:rPr>
           <w:lang w:val="en_US" w:bidi="en_US"/>
         </w:rPr>
-        <w:t>). During Jesus' trial, Caiaphas tore his robes when Jesus claimed to be the Son of God. He urged the high council to condemn Jesus for blasphemy (</w:t>
+        <w:t>). During the trial of Jesus, Caiaphas tore his robes when Jesus claimed to be the Son of God. He urged the high council to condemn Jesus for blasphemy (</w:t>
       </w:r>
       <w:hyperlink r:id="rId266">
         <w:r>
@@ -6589,7 +6589,7 @@
         <w:rPr>
           <w:lang w:val="en_US" w:bidi="en_US"/>
         </w:rPr>
-        <w:t>Shortly after Jesus's execution, Jewish leaders grew worried about the rising number of Christ's followers. Annas and Caiaphas questioned Peter and John about healing a crippled beggar and preaching about the resurrection of the dead (</w:t>
+        <w:t>Shortly after Jesus was executed, Jewish leaders grew worried about the rising number of Christ's followers. Annas and Caiaphas took part in questioning Peter and John after they healed a man who had been unable to walk and preached about the resurrection of the dead (</w:t>
       </w:r>
       <w:hyperlink r:id="rId267">
         <w:r>
@@ -7926,7 +7926,7 @@
         <w:rPr>
           <w:lang w:val="en_US" w:bidi="en_US"/>
         </w:rPr>
-        <w:t xml:space="preserve">). During the exile in Babylon, the Jews started using Aramaic; parts of Ezra and Daniel are in Aramaic. Aramaic was the common language from Egypt to India during the Persian period and was widely spoken in Palestine during Jesus' time (see </w:t>
+        <w:t xml:space="preserve">). During the exile in Babylon, the Jews started using Aramaic; parts of Ezra and Daniel are in Aramaic. Aramaic was the common language from Egypt to India during the Persian period and was widely spoken in Palestine during the time of Jesus (see </w:t>
       </w:r>
       <w:hyperlink r:id="rId311">
         <w:r>

</xml_diff>